<commit_message>
Update functional spec docx
</commit_message>
<xml_diff>
--- a/docs/8NewLight_Functional_Spec.docx
+++ b/docs/8NewLight_Functional_Spec.docx
@@ -28,11 +28,11 @@
         <w:rPr>
           <w:b/>
         </w:rPr>
-        <w:t>Version 0.4.0</w:t>
+        <w:t>Version 0.5.0</w:t>
         <w:br/>
       </w:r>
       <w:r>
-        <w:t>Date: 2026-07-10</w:t>
+        <w:t>Date: 2026-07-11</w:t>
         <w:br/>
       </w:r>
       <w:r>
@@ -805,10 +805,7 @@
           </w:tcPr>
           <w:p>
             <w:r>
-              <w:rPr>
-                <w:sz w:val="18"/>
-              </w:rPr>
-              <w:t>One-page report: menu, ingredients, recipes, sales</w:t>
+              <w:t>Dynamic drill-down dashboard: KPI scorecard vs targets, payment mix (Cash/QRIS/Transfer), product performance with costing drill-down, cashflow ledger with running balance, forecast (run-rate + next-month projection), monthly budget vs actual</w:t>
             </w:r>
           </w:p>
         </w:tc>
@@ -4707,6 +4704,38 @@
           </w:p>
         </w:tc>
       </w:tr>
+      <w:tr>
+        <w:tc>
+          <w:tcPr>
+            <w:tcW w:type="dxa" w:w="2880"/>
+          </w:tcPr>
+          <w:p>
+            <w:r>
+              <w:t>GET</w:t>
+            </w:r>
+          </w:p>
+        </w:tc>
+        <w:tc>
+          <w:tcPr>
+            <w:tcW w:type="dxa" w:w="2880"/>
+          </w:tcPr>
+          <w:p>
+            <w:r>
+              <w:t>/api/budget?month=</w:t>
+            </w:r>
+          </w:p>
+        </w:tc>
+        <w:tc>
+          <w:tcPr>
+            <w:tcW w:type="dxa" w:w="2880"/>
+          </w:tcPr>
+          <w:p>
+            <w:r>
+              <w:t>Budget vs Actual: revenue, COGS, OPEX with variance</w:t>
+            </w:r>
+          </w:p>
+        </w:tc>
+      </w:tr>
     </w:tbl>
     <w:p/>
     <w:p>
@@ -5015,6 +5044,230 @@
                 <w:sz w:val="18"/>
               </w:rPr>
               <w:t>Today's sales export (XLSX)</w:t>
+            </w:r>
+          </w:p>
+        </w:tc>
+      </w:tr>
+      <w:tr>
+        <w:tc>
+          <w:tcPr>
+            <w:tcW w:type="dxa" w:w="2880"/>
+          </w:tcPr>
+          <w:p>
+            <w:r>
+              <w:t>GET</w:t>
+            </w:r>
+          </w:p>
+        </w:tc>
+        <w:tc>
+          <w:tcPr>
+            <w:tcW w:type="dxa" w:w="2880"/>
+          </w:tcPr>
+          <w:p>
+            <w:r>
+              <w:t>/api/reports/product-sales?month=</w:t>
+            </w:r>
+          </w:p>
+        </w:tc>
+        <w:tc>
+          <w:tcPr>
+            <w:tcW w:type="dxa" w:w="2880"/>
+          </w:tcPr>
+          <w:p>
+            <w:r>
+              <w:t>Per-product sales breakdown with COGS + margin</w:t>
+            </w:r>
+          </w:p>
+        </w:tc>
+      </w:tr>
+      <w:tr>
+        <w:tc>
+          <w:tcPr>
+            <w:tcW w:type="dxa" w:w="2880"/>
+          </w:tcPr>
+          <w:p>
+            <w:r>
+              <w:t>GET</w:t>
+            </w:r>
+          </w:p>
+        </w:tc>
+        <w:tc>
+          <w:tcPr>
+            <w:tcW w:type="dxa" w:w="2880"/>
+          </w:tcPr>
+          <w:p>
+            <w:r>
+              <w:t>/api/reports/product-detail?id=&amp;month=</w:t>
+            </w:r>
+          </w:p>
+        </w:tc>
+        <w:tc>
+          <w:tcPr>
+            <w:tcW w:type="dxa" w:w="2880"/>
+          </w:tcPr>
+          <w:p>
+            <w:r>
+              <w:t>Product drill-down: recipe costing + daily sales</w:t>
+            </w:r>
+          </w:p>
+        </w:tc>
+      </w:tr>
+      <w:tr>
+        <w:tc>
+          <w:tcPr>
+            <w:tcW w:type="dxa" w:w="2880"/>
+          </w:tcPr>
+          <w:p>
+            <w:r>
+              <w:t>GET</w:t>
+            </w:r>
+          </w:p>
+        </w:tc>
+        <w:tc>
+          <w:tcPr>
+            <w:tcW w:type="dxa" w:w="2880"/>
+          </w:tcPr>
+          <w:p>
+            <w:r>
+              <w:t>/api/reports/forecast?month=</w:t>
+            </w:r>
+          </w:p>
+        </w:tc>
+        <w:tc>
+          <w:tcPr>
+            <w:tcW w:type="dxa" w:w="2880"/>
+          </w:tcPr>
+          <w:p>
+            <w:r>
+              <w:t>Run-rate finish + next-month revenue projection (linear regression)</w:t>
+            </w:r>
+          </w:p>
+        </w:tc>
+      </w:tr>
+      <w:tr>
+        <w:tc>
+          <w:tcPr>
+            <w:tcW w:type="dxa" w:w="2880"/>
+          </w:tcPr>
+          <w:p>
+            <w:r>
+              <w:t>GET</w:t>
+            </w:r>
+          </w:p>
+        </w:tc>
+        <w:tc>
+          <w:tcPr>
+            <w:tcW w:type="dxa" w:w="2880"/>
+          </w:tcPr>
+          <w:p>
+            <w:r>
+              <w:t>/api/reports/kpi-scorecard?month=</w:t>
+            </w:r>
+          </w:p>
+        </w:tc>
+        <w:tc>
+          <w:tcPr>
+            <w:tcW w:type="dxa" w:w="2880"/>
+          </w:tcPr>
+          <w:p>
+            <w:r>
+              <w:t>KPI actuals vs targets (gross margin, COGS ratio, OPEX ratio, net margin)</w:t>
+            </w:r>
+          </w:p>
+        </w:tc>
+      </w:tr>
+      <w:tr>
+        <w:tc>
+          <w:tcPr>
+            <w:tcW w:type="dxa" w:w="2880"/>
+          </w:tcPr>
+          <w:p>
+            <w:r>
+              <w:t>PUT</w:t>
+            </w:r>
+          </w:p>
+        </w:tc>
+        <w:tc>
+          <w:tcPr>
+            <w:tcW w:type="dxa" w:w="2880"/>
+          </w:tcPr>
+          <w:p>
+            <w:r>
+              <w:t>/api/reports/kpi-targets</w:t>
+            </w:r>
+          </w:p>
+        </w:tc>
+        <w:tc>
+          <w:tcPr>
+            <w:tcW w:type="dxa" w:w="2880"/>
+          </w:tcPr>
+          <w:p>
+            <w:r>
+              <w:t>Bulk update KPI target values</w:t>
+            </w:r>
+          </w:p>
+        </w:tc>
+      </w:tr>
+      <w:tr>
+        <w:tc>
+          <w:tcPr>
+            <w:tcW w:type="dxa" w:w="2880"/>
+          </w:tcPr>
+          <w:p>
+            <w:r>
+              <w:t>GET</w:t>
+            </w:r>
+          </w:p>
+        </w:tc>
+        <w:tc>
+          <w:tcPr>
+            <w:tcW w:type="dxa" w:w="2880"/>
+          </w:tcPr>
+          <w:p>
+            <w:r>
+              <w:t>/api/reports/payment-mix?month=</w:t>
+            </w:r>
+          </w:p>
+        </w:tc>
+        <w:tc>
+          <w:tcPr>
+            <w:tcW w:type="dxa" w:w="2880"/>
+          </w:tcPr>
+          <w:p>
+            <w:r>
+              <w:t>Revenue breakdown by payment method (cash/QRIS/transfer)</w:t>
+            </w:r>
+          </w:p>
+        </w:tc>
+      </w:tr>
+      <w:tr>
+        <w:tc>
+          <w:tcPr>
+            <w:tcW w:type="dxa" w:w="2880"/>
+          </w:tcPr>
+          <w:p>
+            <w:r>
+              <w:t>GET</w:t>
+            </w:r>
+          </w:p>
+        </w:tc>
+        <w:tc>
+          <w:tcPr>
+            <w:tcW w:type="dxa" w:w="2880"/>
+          </w:tcPr>
+          <w:p>
+            <w:r>
+              <w:t>/api/reports/cashflow?month=</w:t>
+            </w:r>
+          </w:p>
+        </w:tc>
+        <w:tc>
+          <w:tcPr>
+            <w:tcW w:type="dxa" w:w="2880"/>
+          </w:tcPr>
+          <w:p>
+            <w:r>
+              <w:t>Daily cashflow ledger with running balance</w:t>
             </w:r>
           </w:p>
         </w:tc>
@@ -5250,6 +5503,38 @@
                 <w:sz w:val="18"/>
               </w:rPr>
               <w:t>Purchase → Inventory → Recipe → HPP flow documented. Unified purchase form (all purchases link to ingredients). Import Center with 4 import types + templates. System Report page. Enhanced purchase.html with frozen layout + stats dashboard.</w:t>
+            </w:r>
+          </w:p>
+        </w:tc>
+      </w:tr>
+      <w:tr>
+        <w:tc>
+          <w:tcPr>
+            <w:tcW w:type="dxa" w:w="2880"/>
+          </w:tcPr>
+          <w:p>
+            <w:r>
+              <w:t>0.5.0</w:t>
+            </w:r>
+          </w:p>
+        </w:tc>
+        <w:tc>
+          <w:tcPr>
+            <w:tcW w:type="dxa" w:w="2880"/>
+          </w:tcPr>
+          <w:p>
+            <w:r>
+              <w:t>2026-07-11</w:t>
+            </w:r>
+          </w:p>
+        </w:tc>
+        <w:tc>
+          <w:tcPr>
+            <w:tcW w:type="dxa" w:w="2880"/>
+          </w:tcPr>
+          <w:p>
+            <w:r>
+              <w:t>System Report expanded: KPI scorecard vs targets, payment mix (Cash/QRIS/Transfer), cashflow ledger with running balance, forecast (run-rate + linear regression), in-page drill-down drawer, monthly budget vs actual module (/api/budget). Employee management: admin delete users, PIN fixes, richer dashboard.</w:t>
             </w:r>
           </w:p>
         </w:tc>

</xml_diff>

<commit_message>
Bring Analytics page to parity with Dashboard drill-down
Revenue KPI drill-down now shows a chronological "By day" list (was a
non-clickable top-6-by-revenue list) that opens a summary-first day view
(revenue/orders/top products/payment mix, with orders collapsed behind a
toggle) instead of jumping straight to raw transactions. Added back
navigation (drillStack/drillTo/goBack) across all drill levels, matching
the pattern already shipped on Dashboard.

Co-Authored-By: Claude Sonnet 5 <noreply@anthropic.com>
</commit_message>
<xml_diff>
--- a/docs/8NewLight_Functional_Spec.docx
+++ b/docs/8NewLight_Functional_Spec.docx
@@ -25,10 +25,9 @@
     <w:p>
       <w:r/>
       <w:r>
-        <w:rPr/>
-        <w:t>Version 0.7.0</w:t>
+        <w:t>Version 0.8.0</w:t>
         <w:br/>
-        <w:t>Date: 2026-07-13</w:t>
+        <w:t>Date: 2026-07-14</w:t>
         <w:br/>
         <w:t>Project: thumbaz_8newlight_codewhale</w:t>
         <w:br/>
@@ -1328,6 +1327,20 @@
       </w:tr>
     </w:tbl>
     <w:p/>
+    <w:p>
+      <w:pPr>
+        <w:pStyle w:val="Heading2"/>
+      </w:pPr>
+      <w:r>
+        <w:t>1.5 Progressive Web App</w:t>
+      </w:r>
+    </w:p>
+    <w:p>
+      <w:pPr/>
+      <w:r>
+        <w:t>The app is installable on phones/tablets ("Add to Home Screen") via a web manifest (public/manifest.json) and a minimal service worker (public/sw.js). The service worker deliberately caches only static shell assets (CSS/JS/icons) — never HTML pages or /api/* responses — since this is a live business system and a stale cached inventory count or price would be actively harmful. Registration happens via public/pwa.js, included on every page. Installation on iOS requires the manual Safari Share -&gt; Add to Home Screen flow (Apple does not support an automatic install prompt); Android/Chrome supports the standard automatic install banner.</w:t>
+      </w:r>
+    </w:p>
     <w:p>
       <w:pPr>
         <w:pStyle w:val="Heading1"/>
@@ -3572,12 +3585,9 @@
       </w:r>
     </w:p>
     <w:p>
+      <w:r/>
       <w:r>
-        <w:rPr>
-          <w:b w:val="0"/>
-          <w:i w:val="0"/>
-        </w:rPr>
-        <w:t>The role-based dashboard (/dashboard.html) gives owners a P&amp;L snapshot: revenue, gross profit, expenses and net profit hero cards with month-over-month deltas (rising expenses shown as negative), a daily revenue chart, a "where the money goes" breakdown, top products, and an alerts panel. Managers/staff see a simpler view.</w:t>
+        <w:t>The role-based dashboard (/dashboard.html) is the admin's landing page after login. It gives owners a P&amp;L snapshot: revenue, gross profit, expenses, net profit, and net margin hero cards with month-over-month deltas (rising expenses shown as negative), a daily revenue chart, a "where the money goes" breakdown, top 5 products, and a needs-attention alerts panel. Two live strips above the month-scoped view refresh independently every 60s regardless of the month filter: Month-to-Date (cumulative from day 1 through today, vs the same day-of-month last month) and Today vs Yesterday (a same/next-day pulse check distinct from MTD's month-long trend). All 5 KPI cards, the top-5 products list, and the daily chart bars are clickable and open the same slide-over drill-down drawer used on the Analytics page (see 5.3), including real back navigation (a history stack, not just close) so a drill can go Revenue -&gt; a specific day -&gt; that day's orders -&gt; a single order's line items and step back one level at a time. A Stock Alerts panel renders low/out-of-stock ingredients as a severity heatmap: ingredients that feed a top-10 selling product this month are prioritized (🔥 badge, darker tile) over equally out-of-stock items that don't threaten revenue, plus a feed of recent manual stock adjustments. Managers/staff see a simpler, non-drillable KPI view.</w:t>
       </w:r>
     </w:p>
     <w:p>
@@ -7068,6 +7078,70 @@
           </w:p>
         </w:tc>
       </w:tr>
+      <w:tr>
+        <w:tc>
+          <w:tcPr>
+            <w:tcW w:type="dxa" w:w="2880"/>
+          </w:tcPr>
+          <w:p>
+            <w:r>
+              <w:t>GET</w:t>
+            </w:r>
+          </w:p>
+        </w:tc>
+        <w:tc>
+          <w:tcPr>
+            <w:tcW w:type="dxa" w:w="2880"/>
+          </w:tcPr>
+          <w:p>
+            <w:r>
+              <w:t>/api/reports/today-vs-yesterday</w:t>
+            </w:r>
+          </w:p>
+        </w:tc>
+        <w:tc>
+          <w:tcPr>
+            <w:tcW w:type="dxa" w:w="2880"/>
+          </w:tcPr>
+          <w:p>
+            <w:r>
+              <w:t>Live day-over-day pulse check (today vs yesterday revenue/orders/gross-profit)</w:t>
+            </w:r>
+          </w:p>
+        </w:tc>
+      </w:tr>
+      <w:tr>
+        <w:tc>
+          <w:tcPr>
+            <w:tcW w:type="dxa" w:w="2880"/>
+          </w:tcPr>
+          <w:p>
+            <w:r>
+              <w:t>GET</w:t>
+            </w:r>
+          </w:p>
+        </w:tc>
+        <w:tc>
+          <w:tcPr>
+            <w:tcW w:type="dxa" w:w="2880"/>
+          </w:tcPr>
+          <w:p>
+            <w:r>
+              <w:t>/api/reports/critical-ingredients</w:t>
+            </w:r>
+          </w:p>
+        </w:tc>
+        <w:tc>
+          <w:tcPr>
+            <w:tcW w:type="dxa" w:w="2880"/>
+          </w:tcPr>
+          <w:p>
+            <w:r>
+              <w:t>Maps ingredients to the top-10 products (by revenue) that use them, for prioritizing stock alerts</w:t>
+            </w:r>
+          </w:p>
+        </w:tc>
+      </w:tr>
     </w:tbl>
     <w:p/>
     <w:p>
@@ -7680,6 +7754,38 @@
           <w:p>
             <w:r>
               <w:t>Transaction import matcher (comma/variant POS naming → canonical products) + legacy .xls support; dedicated Riwayat Transaksi import with receipt grouping, cancellation handling, duplicate-safe re-upload, and automatic stock deduction. Fixed a day-grouping bug in Daily Sales and Cashflow (grouped by full timestamp instead of calendar date — showed one row per transaction). Fixed the month-picker defaulting to the browser's clock instead of the server's data (available-months endpoint). Added live Month-to-Date stats (Dashboard + Analytics), replacing a single-day "Today" card. Role-based post-login landing: admin→Dashboard, manager→Analytics, staff→Clock. Inventory: fixed Add/Remove adjustment sign bug (UI toggle replaces typed minus sign), stat-card drill-down to filtered ingredient lists, click-row-to-adjust, and export/import for physical stock count reconciliation. Recipe page/export now show food/snack items once they have a real recipe (was a blanket category exclusion). Consolidated local dev to a single running app (thumbaz-8newlight under PM2, port 3101); retired the older coffee-pos/8NewLight-POS processes.</w:t>
+            </w:r>
+          </w:p>
+        </w:tc>
+      </w:tr>
+      <w:tr>
+        <w:tc>
+          <w:tcPr>
+            <w:tcW w:type="dxa" w:w="2880"/>
+          </w:tcPr>
+          <w:p>
+            <w:r>
+              <w:t>0.8.0</w:t>
+            </w:r>
+          </w:p>
+        </w:tc>
+        <w:tc>
+          <w:tcPr>
+            <w:tcW w:type="dxa" w:w="2880"/>
+          </w:tcPr>
+          <w:p>
+            <w:r>
+              <w:t>2026-07-14</w:t>
+            </w:r>
+          </w:p>
+        </w:tc>
+        <w:tc>
+          <w:tcPr>
+            <w:tcW w:type="dxa" w:w="2880"/>
+          </w:tcPr>
+          <w:p>
+            <w:r>
+              <w:t>PWA support: installable on phones/tablets via manifest + minimal service worker (static shell only, never caches pages/API data). Dashboard: full drill-down drawer ported from Analytics (all KPI cards, top products, daily chart bars clickable; Revenue drills monthly -&gt; by-day summary -&gt; orders -&gt; line items) with real back navigation. Added Today-vs-Yesterday live comparison and a Stock Alerts panel rendering low/out-of-stock ingredients as a severity heatmap prioritized by whether they feed a top-10 seller. Fixed /api/reports/daily grouping by full timestamp instead of calendar date (was producing one chart bar per transaction and breaking the day drill-down).</w:t>
             </w:r>
           </w:p>
         </w:tc>

</xml_diff>

<commit_message>
Update functional spec through v0.11.0
Catches the doc up on 26 undocumented commits: Transactions page, Stock
Adjustment split-out, the New POS concept, customers/loyalty program,
discounts, and the void redesign.

Co-Authored-By: Claude Sonnet 5 <noreply@anthropic.com>
</commit_message>
<xml_diff>
--- a/docs/8NewLight_Functional_Spec.docx
+++ b/docs/8NewLight_Functional_Spec.docx
@@ -25,13 +25,13 @@
     <w:p>
       <w:r/>
       <w:r>
-        <w:t>Version 0.8.0</w:t>
+        <w:t>Version 0.11.0</w:t>
         <w:br/>
-        <w:t>Date: 2026-07-14</w:t>
+        <w:t>Date: 2026-07-16</w:t>
         <w:br/>
         <w:t>Project: thumbaz_8newlight_codewhale</w:t>
         <w:br/>
-        <w:t>Scope: Complete specification of the deployed back-office system (menu, ingredients, recipes, purchasing, inventory, POS/sales, employees, expenses, budgeting, and analytics).</w:t>
+        <w:t>Scope: Complete specification of the deployed back-office system (menu, ingredients, recipes, purchasing, inventory, POS/sales, employees, expenses, budgeting, and analytics, POS register/kitchen/modifiers, customers &amp; loyalty).</w:t>
       </w:r>
     </w:p>
     <w:p/>
@@ -388,6 +388,41 @@
           </w:p>
         </w:tc>
       </w:tr>
+      <w:tr>
+        <w:tc>
+          <w:tcPr>
+            <w:tcW w:type="dxa" w:w="2880"/>
+          </w:tcPr>
+          <w:p>
+            <w:r/>
+            <w:r>
+              <w:t>QR codes</w:t>
+            </w:r>
+          </w:p>
+        </w:tc>
+        <w:tc>
+          <w:tcPr>
+            <w:tcW w:type="dxa" w:w="2880"/>
+          </w:tcPr>
+          <w:p>
+            <w:r/>
+            <w:r>
+              <w:t>qrcode (npm)</w:t>
+            </w:r>
+          </w:p>
+        </w:tc>
+        <w:tc>
+          <w:tcPr>
+            <w:tcW w:type="dxa" w:w="2880"/>
+          </w:tcPr>
+          <w:p>
+            <w:r/>
+            <w:r>
+              <w:t>Renders receipt/QR images for the New POS receipt screen</w:t>
+            </w:r>
+          </w:p>
+        </w:tc>
+      </w:tr>
     </w:tbl>
     <w:p/>
     <w:p>
@@ -407,7 +442,7 @@
           <w:b w:val="0"/>
           <w:i w:val="0"/>
         </w:rPr>
-        <w:t>Three roles are enforced by the requireRole middleware. Almost every API is gated to admin+manager ("manager" guard); staff are restricted to authentication and their own attendance flow.</w:t>
+        <w:t>Three roles are enforced by the requireRole middleware. Most back-office APIs are gated to admin+manager ("manager" guard). Staff additionally reach a POS-scoped set — /api/modifiers, /api/kitchen, /api/pos-ingredients, /api/pos-category-sales, /api/customers, /api/loyalty-config, /api/qr — so the register, kitchen board, and loyalty lookups work without a manager login; everything else still returns 401/403.</w:t>
       </w:r>
     </w:p>
     <w:tbl>
@@ -545,18 +580,20 @@
             <w:tcW w:type="dxa" w:w="2880"/>
           </w:tcPr>
           <w:p>
-            <w:r>
-              <w:t>Login + attendance (clock in/out)</w:t>
-            </w:r>
-          </w:p>
-        </w:tc>
-        <w:tc>
-          <w:tcPr>
-            <w:tcW w:type="dxa" w:w="2880"/>
-          </w:tcPr>
-          <w:p>
-            <w:r>
-              <w:t>Landing page is /clock.html; other pages/APIs return 401/403</w:t>
+            <w:r/>
+            <w:r>
+              <w:t>Login + POS register (cart, kitchen tickets, modifiers, customer/loyalty lookup) + attendance (clock in/out)</w:t>
+            </w:r>
+          </w:p>
+        </w:tc>
+        <w:tc>
+          <w:tcPr>
+            <w:tcW w:type="dxa" w:w="2880"/>
+          </w:tcPr>
+          <w:p>
+            <w:r/>
+            <w:r>
+              <w:t>Landing page is the New POS register (/pos/ui/1/register); manager-gated back-office pages/APIs still return 401/403</w:t>
             </w:r>
           </w:p>
         </w:tc>
@@ -785,8 +822,9 @@
             <w:tcW w:type="dxa" w:w="2160"/>
           </w:tcPr>
           <w:p>
-            <w:r>
-              <w:t>—</w:t>
+            <w:r/>
+            <w:r>
+              <w:t>Management</w:t>
             </w:r>
           </w:p>
         </w:tc>
@@ -795,8 +833,9 @@
             <w:tcW w:type="dxa" w:w="2160"/>
           </w:tcPr>
           <w:p>
-            <w:r>
-              <w:t>POS</w:t>
+            <w:r/>
+            <w:r>
+              <w:t>Transactions</w:t>
             </w:r>
           </w:p>
         </w:tc>
@@ -805,8 +844,9 @@
             <w:tcW w:type="dxa" w:w="2160"/>
           </w:tcPr>
           <w:p>
-            <w:r>
-              <w:t>/pos.html</w:t>
+            <w:r/>
+            <w:r>
+              <w:t>/transactions.html</w:t>
             </w:r>
           </w:p>
         </w:tc>
@@ -815,8 +855,9 @@
             <w:tcW w:type="dxa" w:w="2160"/>
           </w:tcPr>
           <w:p>
-            <w:r>
-              <w:t>Point-of-sale: product grid, cart, checkout, daily sales</w:t>
+            <w:r/>
+            <w:r>
+              <w:t>Standalone transaction list/search (filters, sort, pagination) with an order drill-down drawer; supports voiding any historical order directly (restock or keep-inventory choice + reason)</w:t>
             </w:r>
           </w:p>
         </w:tc>
@@ -838,7 +879,7 @@
           </w:tcPr>
           <w:p>
             <w:r>
-              <w:t>Inventory</w:t>
+              <w:t>POS</w:t>
             </w:r>
           </w:p>
         </w:tc>
@@ -848,7 +889,7 @@
           </w:tcPr>
           <w:p>
             <w:r>
-              <w:t>/inventory.html</w:t>
+              <w:t>/pos/ui/1/register</w:t>
             </w:r>
           </w:p>
         </w:tc>
@@ -858,7 +899,7 @@
           </w:tcPr>
           <w:p>
             <w:r>
-              <w:t>Stock on-hand, KPIs with drill-down, click-to-adjust (Add/Remove), thresholds, export/import for physical counts</w:t>
+              <w:t>New POS concept (linked from sidebar as "POS"): full register UI with cart, modifiers, on-the-fly custom items, customer/loyalty picker, discount keypad, "Send to Bar" kitchen tickets, receipt + QR. The original /pos.html remains for side-by-side comparison but is no longer linked in navigation.</w:t>
             </w:r>
           </w:p>
         </w:tc>
@@ -870,7 +911,7 @@
           </w:tcPr>
           <w:p>
             <w:r>
-              <w:t>Product</w:t>
+              <w:t>—</w:t>
             </w:r>
           </w:p>
         </w:tc>
@@ -880,7 +921,7 @@
           </w:tcPr>
           <w:p>
             <w:r>
-              <w:t>Menu Items</w:t>
+              <w:t>Inventory</w:t>
             </w:r>
           </w:p>
         </w:tc>
@@ -890,7 +931,7 @@
           </w:tcPr>
           <w:p>
             <w:r>
-              <w:t>/menu.html</w:t>
+              <w:t>/inventory.html</w:t>
             </w:r>
           </w:p>
         </w:tc>
@@ -900,7 +941,7 @@
           </w:tcPr>
           <w:p>
             <w:r>
-              <w:t>Product CRUD, pricing, categories, resale toggle, Excel import/export</w:t>
+              <w:t>Stock on-hand, KPIs with drill-down, click-to-adjust (Add/Remove), thresholds, export/import for physical counts</w:t>
             </w:r>
           </w:p>
         </w:tc>
@@ -911,8 +952,9 @@
             <w:tcW w:type="dxa" w:w="2160"/>
           </w:tcPr>
           <w:p>
-            <w:r>
-              <w:t>Product</w:t>
+            <w:r/>
+            <w:r>
+              <w:t>—</w:t>
             </w:r>
           </w:p>
         </w:tc>
@@ -921,8 +963,9 @@
             <w:tcW w:type="dxa" w:w="2160"/>
           </w:tcPr>
           <w:p>
-            <w:r>
-              <w:t>Recipe</w:t>
+            <w:r/>
+            <w:r>
+              <w:t>Stock Adjustment</w:t>
             </w:r>
           </w:p>
         </w:tc>
@@ -931,8 +974,9 @@
             <w:tcW w:type="dxa" w:w="2160"/>
           </w:tcPr>
           <w:p>
-            <w:r>
-              <w:t>/receipe.html</w:t>
+            <w:r/>
+            <w:r>
+              <w:t>/stock-adjustment.html</w:t>
             </w:r>
           </w:p>
         </w:tc>
@@ -941,8 +985,9 @@
             <w:tcW w:type="dxa" w:w="2160"/>
           </w:tcPr>
           <w:p>
-            <w:r>
-              <w:t>Recipe assignments per product, HPP costing, export</w:t>
+            <w:r/>
+            <w:r>
+              <w:t>Dedicated Add/Remove stock panel split out of Inventory: KPI cards, highlighted ingredient picker with Category column, movement-list cross-highlight</w:t>
             </w:r>
           </w:p>
         </w:tc>
@@ -953,8 +998,9 @@
             <w:tcW w:type="dxa" w:w="2160"/>
           </w:tcPr>
           <w:p>
-            <w:r>
-              <w:t>Product</w:t>
+            <w:r/>
+            <w:r>
+              <w:t>—</w:t>
             </w:r>
           </w:p>
         </w:tc>
@@ -963,8 +1009,9 @@
             <w:tcW w:type="dxa" w:w="2160"/>
           </w:tcPr>
           <w:p>
-            <w:r>
-              <w:t>Ingredients</w:t>
+            <w:r/>
+            <w:r>
+              <w:t>Kitchen</w:t>
             </w:r>
           </w:p>
         </w:tc>
@@ -973,8 +1020,9 @@
             <w:tcW w:type="dxa" w:w="2160"/>
           </w:tcPr>
           <w:p>
-            <w:r>
-              <w:t>/ingredients.html</w:t>
+            <w:r/>
+            <w:r>
+              <w:t>/kitchen.html</w:t>
             </w:r>
           </w:p>
         </w:tc>
@@ -983,8 +1031,9 @@
             <w:tcW w:type="dxa" w:w="2160"/>
           </w:tcPr>
           <w:p>
-            <w:r>
-              <w:t>Ingredient catalog, unit prices, category CRUD</w:t>
+            <w:r/>
+            <w:r>
+              <w:t>Barista ticket queue (KDS) fed by the New POS "Send to Bar": New → Preparing → Ready → Served status board</w:t>
             </w:r>
           </w:p>
         </w:tc>
@@ -996,7 +1045,7 @@
           </w:tcPr>
           <w:p>
             <w:r>
-              <w:t>Purchase</w:t>
+              <w:t>Product</w:t>
             </w:r>
           </w:p>
         </w:tc>
@@ -1006,7 +1055,7 @@
           </w:tcPr>
           <w:p>
             <w:r>
-              <w:t>Purchases</w:t>
+              <w:t>Menu Items</w:t>
             </w:r>
           </w:p>
         </w:tc>
@@ -1016,7 +1065,7 @@
           </w:tcPr>
           <w:p>
             <w:r>
-              <w:t>/purchase.html</w:t>
+              <w:t>/menu.html</w:t>
             </w:r>
           </w:p>
         </w:tc>
@@ -1026,7 +1075,7 @@
           </w:tcPr>
           <w:p>
             <w:r>
-              <w:t>Record purchases; updates inventory + latest price</w:t>
+              <w:t>Product CRUD, pricing, categories, resale toggle, Excel import/export</w:t>
             </w:r>
           </w:p>
         </w:tc>
@@ -1038,7 +1087,7 @@
           </w:tcPr>
           <w:p>
             <w:r>
-              <w:t>Purchase</w:t>
+              <w:t>Product</w:t>
             </w:r>
           </w:p>
         </w:tc>
@@ -1048,7 +1097,7 @@
           </w:tcPr>
           <w:p>
             <w:r>
-              <w:t>Expenses</w:t>
+              <w:t>Recipe</w:t>
             </w:r>
           </w:p>
         </w:tc>
@@ -1058,7 +1107,7 @@
           </w:tcPr>
           <w:p>
             <w:r>
-              <w:t>/expenses.html</w:t>
+              <w:t>/receipe.html</w:t>
             </w:r>
           </w:p>
         </w:tc>
@@ -1068,7 +1117,7 @@
           </w:tcPr>
           <w:p>
             <w:r>
-              <w:t>Non-ingredient operating costs</w:t>
+              <w:t>Recipe assignments per product, HPP costing, export</w:t>
             </w:r>
           </w:p>
         </w:tc>
@@ -1080,7 +1129,7 @@
           </w:tcPr>
           <w:p>
             <w:r>
-              <w:t>Purchase</w:t>
+              <w:t>Product</w:t>
             </w:r>
           </w:p>
         </w:tc>
@@ -1090,7 +1139,7 @@
           </w:tcPr>
           <w:p>
             <w:r>
-              <w:t>Suppliers</w:t>
+              <w:t>Ingredients</w:t>
             </w:r>
           </w:p>
         </w:tc>
@@ -1100,7 +1149,7 @@
           </w:tcPr>
           <w:p>
             <w:r>
-              <w:t>/supplier.html</w:t>
+              <w:t>/ingredients.html</w:t>
             </w:r>
           </w:p>
         </w:tc>
@@ -1110,7 +1159,7 @@
           </w:tcPr>
           <w:p>
             <w:r>
-              <w:t>Supplier directory</w:t>
+              <w:t>Ingredient catalog, unit prices, category CRUD</w:t>
             </w:r>
           </w:p>
         </w:tc>
@@ -1122,7 +1171,7 @@
           </w:tcPr>
           <w:p>
             <w:r>
-              <w:t>Employees</w:t>
+              <w:t>Purchase</w:t>
             </w:r>
           </w:p>
         </w:tc>
@@ -1132,7 +1181,7 @@
           </w:tcPr>
           <w:p>
             <w:r>
-              <w:t>Users</w:t>
+              <w:t>Purchases</w:t>
             </w:r>
           </w:p>
         </w:tc>
@@ -1142,7 +1191,7 @@
           </w:tcPr>
           <w:p>
             <w:r>
-              <w:t>/employees.html</w:t>
+              <w:t>/purchase.html</w:t>
             </w:r>
           </w:p>
         </w:tc>
@@ -1152,7 +1201,7 @@
           </w:tcPr>
           <w:p>
             <w:r>
-              <w:t>Staff CRUD (admin), team KPIs</w:t>
+              <w:t>Record purchases; updates inventory + latest price</w:t>
             </w:r>
           </w:p>
         </w:tc>
@@ -1164,7 +1213,7 @@
           </w:tcPr>
           <w:p>
             <w:r>
-              <w:t>Employees</w:t>
+              <w:t>Purchase</w:t>
             </w:r>
           </w:p>
         </w:tc>
@@ -1174,7 +1223,7 @@
           </w:tcPr>
           <w:p>
             <w:r>
-              <w:t>Payroll</w:t>
+              <w:t>Expenses</w:t>
             </w:r>
           </w:p>
         </w:tc>
@@ -1184,7 +1233,7 @@
           </w:tcPr>
           <w:p>
             <w:r>
-              <w:t>/payroll.html</w:t>
+              <w:t>/expenses.html</w:t>
             </w:r>
           </w:p>
         </w:tc>
@@ -1194,7 +1243,7 @@
           </w:tcPr>
           <w:p>
             <w:r>
-              <w:t>Monthly payroll (rate, overtime, bonus, deduction)</w:t>
+              <w:t>Non-ingredient operating costs</w:t>
             </w:r>
           </w:p>
         </w:tc>
@@ -1206,6 +1255,48 @@
           </w:tcPr>
           <w:p>
             <w:r>
+              <w:t>Purchase</w:t>
+            </w:r>
+          </w:p>
+        </w:tc>
+        <w:tc>
+          <w:tcPr>
+            <w:tcW w:type="dxa" w:w="2160"/>
+          </w:tcPr>
+          <w:p>
+            <w:r>
+              <w:t>Suppliers</w:t>
+            </w:r>
+          </w:p>
+        </w:tc>
+        <w:tc>
+          <w:tcPr>
+            <w:tcW w:type="dxa" w:w="2160"/>
+          </w:tcPr>
+          <w:p>
+            <w:r>
+              <w:t>/supplier.html</w:t>
+            </w:r>
+          </w:p>
+        </w:tc>
+        <w:tc>
+          <w:tcPr>
+            <w:tcW w:type="dxa" w:w="2160"/>
+          </w:tcPr>
+          <w:p>
+            <w:r>
+              <w:t>Supplier directory</w:t>
+            </w:r>
+          </w:p>
+        </w:tc>
+      </w:tr>
+      <w:tr>
+        <w:tc>
+          <w:tcPr>
+            <w:tcW w:type="dxa" w:w="2160"/>
+          </w:tcPr>
+          <w:p>
+            <w:r>
               <w:t>Employees</w:t>
             </w:r>
           </w:p>
@@ -1216,6 +1307,90 @@
           </w:tcPr>
           <w:p>
             <w:r>
+              <w:t>Users</w:t>
+            </w:r>
+          </w:p>
+        </w:tc>
+        <w:tc>
+          <w:tcPr>
+            <w:tcW w:type="dxa" w:w="2160"/>
+          </w:tcPr>
+          <w:p>
+            <w:r>
+              <w:t>/employees.html</w:t>
+            </w:r>
+          </w:p>
+        </w:tc>
+        <w:tc>
+          <w:tcPr>
+            <w:tcW w:type="dxa" w:w="2160"/>
+          </w:tcPr>
+          <w:p>
+            <w:r>
+              <w:t>Staff CRUD (admin), team KPIs</w:t>
+            </w:r>
+          </w:p>
+        </w:tc>
+      </w:tr>
+      <w:tr>
+        <w:tc>
+          <w:tcPr>
+            <w:tcW w:type="dxa" w:w="2160"/>
+          </w:tcPr>
+          <w:p>
+            <w:r>
+              <w:t>Employees</w:t>
+            </w:r>
+          </w:p>
+        </w:tc>
+        <w:tc>
+          <w:tcPr>
+            <w:tcW w:type="dxa" w:w="2160"/>
+          </w:tcPr>
+          <w:p>
+            <w:r>
+              <w:t>Payroll</w:t>
+            </w:r>
+          </w:p>
+        </w:tc>
+        <w:tc>
+          <w:tcPr>
+            <w:tcW w:type="dxa" w:w="2160"/>
+          </w:tcPr>
+          <w:p>
+            <w:r>
+              <w:t>/payroll.html</w:t>
+            </w:r>
+          </w:p>
+        </w:tc>
+        <w:tc>
+          <w:tcPr>
+            <w:tcW w:type="dxa" w:w="2160"/>
+          </w:tcPr>
+          <w:p>
+            <w:r>
+              <w:t>Monthly payroll (rate, overtime, bonus, deduction)</w:t>
+            </w:r>
+          </w:p>
+        </w:tc>
+      </w:tr>
+      <w:tr>
+        <w:tc>
+          <w:tcPr>
+            <w:tcW w:type="dxa" w:w="2160"/>
+          </w:tcPr>
+          <w:p>
+            <w:r>
+              <w:t>Employees</w:t>
+            </w:r>
+          </w:p>
+        </w:tc>
+        <w:tc>
+          <w:tcPr>
+            <w:tcW w:type="dxa" w:w="2160"/>
+          </w:tcPr>
+          <w:p>
+            <w:r>
               <w:t>Attendance</w:t>
             </w:r>
           </w:p>
@@ -1237,6 +1412,98 @@
           <w:p>
             <w:r>
               <w:t>Clock in/out with photo</w:t>
+            </w:r>
+          </w:p>
+        </w:tc>
+      </w:tr>
+      <w:tr>
+        <w:tc>
+          <w:tcPr>
+            <w:tcW w:type="dxa" w:w="2160"/>
+          </w:tcPr>
+          <w:p>
+            <w:r/>
+            <w:r>
+              <w:t>Customers &amp; Loyalty</w:t>
+            </w:r>
+          </w:p>
+        </w:tc>
+        <w:tc>
+          <w:tcPr>
+            <w:tcW w:type="dxa" w:w="2160"/>
+          </w:tcPr>
+          <w:p>
+            <w:r/>
+            <w:r>
+              <w:t>Customers</w:t>
+            </w:r>
+          </w:p>
+        </w:tc>
+        <w:tc>
+          <w:tcPr>
+            <w:tcW w:type="dxa" w:w="2160"/>
+          </w:tcPr>
+          <w:p>
+            <w:r/>
+            <w:r>
+              <w:t>/customers.html</w:t>
+            </w:r>
+          </w:p>
+        </w:tc>
+        <w:tc>
+          <w:tcPr>
+            <w:tcW w:type="dxa" w:w="2160"/>
+          </w:tcPr>
+          <w:p>
+            <w:r/>
+            <w:r>
+              <w:t>Customer directory (CRUD): name, auto-generated 5-digit member ID, phone, email, points balance</w:t>
+            </w:r>
+          </w:p>
+        </w:tc>
+      </w:tr>
+      <w:tr>
+        <w:tc>
+          <w:tcPr>
+            <w:tcW w:type="dxa" w:w="2160"/>
+          </w:tcPr>
+          <w:p>
+            <w:r/>
+            <w:r>
+              <w:t>Customers &amp; Loyalty</w:t>
+            </w:r>
+          </w:p>
+        </w:tc>
+        <w:tc>
+          <w:tcPr>
+            <w:tcW w:type="dxa" w:w="2160"/>
+          </w:tcPr>
+          <w:p>
+            <w:r/>
+            <w:r>
+              <w:t>Loyalty Setup</w:t>
+            </w:r>
+          </w:p>
+        </w:tc>
+        <w:tc>
+          <w:tcPr>
+            <w:tcW w:type="dxa" w:w="2160"/>
+          </w:tcPr>
+          <w:p>
+            <w:r/>
+            <w:r>
+              <w:t>/pos/ui/1/register#loyalty-setup</w:t>
+            </w:r>
+          </w:p>
+        </w:tc>
+        <w:tc>
+          <w:tcPr>
+            <w:tcW w:type="dxa" w:w="2160"/>
+          </w:tcPr>
+          <w:p>
+            <w:r/>
+            <w:r>
+              <w:t>Editable earn/redeem rules (rupiah per point earned, redeem rate, program on/off), replacing hardcoded constants</w:t>
             </w:r>
           </w:p>
         </w:tc>
@@ -1863,6 +2130,321 @@
           </w:p>
         </w:tc>
       </w:tr>
+      <w:tr>
+        <w:tc>
+          <w:tcPr>
+            <w:tcW w:type="dxa" w:w="2880"/>
+          </w:tcPr>
+          <w:p>
+            <w:r/>
+            <w:r>
+              <w:t>016</w:t>
+            </w:r>
+          </w:p>
+        </w:tc>
+        <w:tc>
+          <w:tcPr>
+            <w:tcW w:type="dxa" w:w="2880"/>
+          </w:tcPr>
+          <w:p>
+            <w:r/>
+            <w:r>
+              <w:t>modifiers</w:t>
+            </w:r>
+          </w:p>
+        </w:tc>
+        <w:tc>
+          <w:tcPr>
+            <w:tcW w:type="dxa" w:w="2880"/>
+          </w:tcPr>
+          <w:p>
+            <w:r/>
+            <w:r>
+              <w:t>POS add-ons (e.g. "Extra Shot"): name, price_delta, active</w:t>
+            </w:r>
+          </w:p>
+        </w:tc>
+      </w:tr>
+      <w:tr>
+        <w:tc>
+          <w:tcPr>
+            <w:tcW w:type="dxa" w:w="2880"/>
+          </w:tcPr>
+          <w:p>
+            <w:r/>
+            <w:r>
+              <w:t>017</w:t>
+            </w:r>
+          </w:p>
+        </w:tc>
+        <w:tc>
+          <w:tcPr>
+            <w:tcW w:type="dxa" w:w="2880"/>
+          </w:tcPr>
+          <w:p>
+            <w:r/>
+            <w:r>
+              <w:t>kitchen</w:t>
+            </w:r>
+          </w:p>
+        </w:tc>
+        <w:tc>
+          <w:tcPr>
+            <w:tcW w:type="dxa" w:w="2880"/>
+          </w:tcPr>
+          <w:p>
+            <w:r/>
+            <w:r>
+              <w:t>Kitchen tickets/items backing the barista queue (KDS) fed by "Send to Bar"</w:t>
+            </w:r>
+          </w:p>
+        </w:tc>
+      </w:tr>
+      <w:tr>
+        <w:tc>
+          <w:tcPr>
+            <w:tcW w:type="dxa" w:w="2880"/>
+          </w:tcPr>
+          <w:p>
+            <w:r/>
+            <w:r>
+              <w:t>018</w:t>
+            </w:r>
+          </w:p>
+        </w:tc>
+        <w:tc>
+          <w:tcPr>
+            <w:tcW w:type="dxa" w:w="2880"/>
+          </w:tcPr>
+          <w:p>
+            <w:r/>
+            <w:r>
+              <w:t>modifier_product</w:t>
+            </w:r>
+          </w:p>
+        </w:tc>
+        <w:tc>
+          <w:tcPr>
+            <w:tcW w:type="dxa" w:w="2880"/>
+          </w:tcPr>
+          <w:p>
+            <w:r/>
+            <w:r>
+              <w:t>Links a modifier to a product so selling it deducts that product’s recipe (Option A)</w:t>
+            </w:r>
+          </w:p>
+        </w:tc>
+      </w:tr>
+      <w:tr>
+        <w:tc>
+          <w:tcPr>
+            <w:tcW w:type="dxa" w:w="2880"/>
+          </w:tcPr>
+          <w:p>
+            <w:r/>
+            <w:r>
+              <w:t>019</w:t>
+            </w:r>
+          </w:p>
+        </w:tc>
+        <w:tc>
+          <w:tcPr>
+            <w:tcW w:type="dxa" w:w="2880"/>
+          </w:tcPr>
+          <w:p>
+            <w:r/>
+            <w:r>
+              <w:t>void_log</w:t>
+            </w:r>
+          </w:p>
+        </w:tc>
+        <w:tc>
+          <w:tcPr>
+            <w:tcW w:type="dxa" w:w="2880"/>
+          </w:tcPr>
+          <w:p>
+            <w:r/>
+            <w:r>
+              <w:t>Audit trail for voided sales: total, items, reason, whether ingredients were restocked</w:t>
+            </w:r>
+          </w:p>
+        </w:tc>
+      </w:tr>
+      <w:tr>
+        <w:tc>
+          <w:tcPr>
+            <w:tcW w:type="dxa" w:w="2880"/>
+          </w:tcPr>
+          <w:p>
+            <w:r/>
+            <w:r>
+              <w:t>020</w:t>
+            </w:r>
+          </w:p>
+        </w:tc>
+        <w:tc>
+          <w:tcPr>
+            <w:tcW w:type="dxa" w:w="2880"/>
+          </w:tcPr>
+          <w:p>
+            <w:r/>
+            <w:r>
+              <w:t>transaction_note</w:t>
+            </w:r>
+          </w:p>
+        </w:tc>
+        <w:tc>
+          <w:tcPr>
+            <w:tcW w:type="dxa" w:w="2880"/>
+          </w:tcPr>
+          <w:p>
+            <w:r/>
+            <w:r>
+              <w:t>Transaction-level customer_note (replaces removed per-line note)</w:t>
+            </w:r>
+          </w:p>
+        </w:tc>
+      </w:tr>
+      <w:tr>
+        <w:tc>
+          <w:tcPr>
+            <w:tcW w:type="dxa" w:w="2880"/>
+          </w:tcPr>
+          <w:p>
+            <w:r/>
+            <w:r>
+              <w:t>021</w:t>
+            </w:r>
+          </w:p>
+        </w:tc>
+        <w:tc>
+          <w:tcPr>
+            <w:tcW w:type="dxa" w:w="2880"/>
+          </w:tcPr>
+          <w:p>
+            <w:r/>
+            <w:r>
+              <w:t>customers</w:t>
+            </w:r>
+          </w:p>
+        </w:tc>
+        <w:tc>
+          <w:tcPr>
+            <w:tcW w:type="dxa" w:w="2880"/>
+          </w:tcPr>
+          <w:p>
+            <w:r/>
+            <w:r>
+              <w:t>Customer directory + loyalty linkage: transactions.customer_id, points_earned</w:t>
+            </w:r>
+          </w:p>
+        </w:tc>
+      </w:tr>
+      <w:tr>
+        <w:tc>
+          <w:tcPr>
+            <w:tcW w:type="dxa" w:w="2880"/>
+          </w:tcPr>
+          <w:p>
+            <w:r/>
+            <w:r>
+              <w:t>022</w:t>
+            </w:r>
+          </w:p>
+        </w:tc>
+        <w:tc>
+          <w:tcPr>
+            <w:tcW w:type="dxa" w:w="2880"/>
+          </w:tcPr>
+          <w:p>
+            <w:r/>
+            <w:r>
+              <w:t>loyalty_redemption</w:t>
+            </w:r>
+          </w:p>
+        </w:tc>
+        <w:tc>
+          <w:tcPr>
+            <w:tcW w:type="dxa" w:w="2880"/>
+          </w:tcPr>
+          <w:p>
+            <w:r/>
+            <w:r>
+              <w:t>transactions.redeem_points / redeem_value — records points spent per sale</w:t>
+            </w:r>
+          </w:p>
+        </w:tc>
+      </w:tr>
+      <w:tr>
+        <w:tc>
+          <w:tcPr>
+            <w:tcW w:type="dxa" w:w="2880"/>
+          </w:tcPr>
+          <w:p>
+            <w:r/>
+            <w:r>
+              <w:t>023</w:t>
+            </w:r>
+          </w:p>
+        </w:tc>
+        <w:tc>
+          <w:tcPr>
+            <w:tcW w:type="dxa" w:w="2880"/>
+          </w:tcPr>
+          <w:p>
+            <w:r/>
+            <w:r>
+              <w:t>loyalty_config</w:t>
+            </w:r>
+          </w:p>
+        </w:tc>
+        <w:tc>
+          <w:tcPr>
+            <w:tcW w:type="dxa" w:w="2880"/>
+          </w:tcPr>
+          <w:p>
+            <w:r/>
+            <w:r>
+              <w:t>Single editable row for earn/redeem rules, replacing hardcoded constants in sales.js</w:t>
+            </w:r>
+          </w:p>
+        </w:tc>
+      </w:tr>
+      <w:tr>
+        <w:tc>
+          <w:tcPr>
+            <w:tcW w:type="dxa" w:w="2880"/>
+          </w:tcPr>
+          <w:p>
+            <w:r/>
+            <w:r>
+              <w:t>024</w:t>
+            </w:r>
+          </w:p>
+        </w:tc>
+        <w:tc>
+          <w:tcPr>
+            <w:tcW w:type="dxa" w:w="2880"/>
+          </w:tcPr>
+          <w:p>
+            <w:r/>
+            <w:r>
+              <w:t>transaction_discount</w:t>
+            </w:r>
+          </w:p>
+        </w:tc>
+        <w:tc>
+          <w:tcPr>
+            <w:tcW w:type="dxa" w:w="2880"/>
+          </w:tcPr>
+          <w:p>
+            <w:r/>
+            <w:r>
+              <w:t>transactions.discount_pct / discount_amount — whole-order discount applied at Payment</w:t>
+            </w:r>
+          </w:p>
+        </w:tc>
+      </w:tr>
     </w:tbl>
     <w:p/>
     <w:p>
@@ -2746,6 +3328,181 @@
           </w:p>
         </w:tc>
       </w:tr>
+      <w:tr>
+        <w:tc>
+          <w:tcPr>
+            <w:tcW w:type="dxa" w:w="2880"/>
+          </w:tcPr>
+          <w:p>
+            <w:r/>
+            <w:r>
+              <w:t>Customer</w:t>
+            </w:r>
+          </w:p>
+        </w:tc>
+        <w:tc>
+          <w:tcPr>
+            <w:tcW w:type="dxa" w:w="2880"/>
+          </w:tcPr>
+          <w:p>
+            <w:r/>
+            <w:r>
+              <w:t>customers</w:t>
+            </w:r>
+          </w:p>
+        </w:tc>
+        <w:tc>
+          <w:tcPr>
+            <w:tcW w:type="dxa" w:w="2880"/>
+          </w:tcPr>
+          <w:p>
+            <w:r/>
+            <w:r>
+              <w:t>Loyalty member; referenced by transactions.customer_id</w:t>
+            </w:r>
+          </w:p>
+        </w:tc>
+      </w:tr>
+      <w:tr>
+        <w:tc>
+          <w:tcPr>
+            <w:tcW w:type="dxa" w:w="2880"/>
+          </w:tcPr>
+          <w:p>
+            <w:r/>
+            <w:r>
+              <w:t>Loyalty config</w:t>
+            </w:r>
+          </w:p>
+        </w:tc>
+        <w:tc>
+          <w:tcPr>
+            <w:tcW w:type="dxa" w:w="2880"/>
+          </w:tcPr>
+          <w:p>
+            <w:r/>
+            <w:r>
+              <w:t>loyalty_config</w:t>
+            </w:r>
+          </w:p>
+        </w:tc>
+        <w:tc>
+          <w:tcPr>
+            <w:tcW w:type="dxa" w:w="2880"/>
+          </w:tcPr>
+          <w:p>
+            <w:r/>
+            <w:r>
+              <w:t>Single row (id=1): earn/redeem rules read by sales.js at checkout</w:t>
+            </w:r>
+          </w:p>
+        </w:tc>
+      </w:tr>
+      <w:tr>
+        <w:tc>
+          <w:tcPr>
+            <w:tcW w:type="dxa" w:w="2880"/>
+          </w:tcPr>
+          <w:p>
+            <w:r/>
+            <w:r>
+              <w:t>Modifier</w:t>
+            </w:r>
+          </w:p>
+        </w:tc>
+        <w:tc>
+          <w:tcPr>
+            <w:tcW w:type="dxa" w:w="2880"/>
+          </w:tcPr>
+          <w:p>
+            <w:r/>
+            <w:r>
+              <w:t>modifiers</w:t>
+            </w:r>
+          </w:p>
+        </w:tc>
+        <w:tc>
+          <w:tcPr>
+            <w:tcW w:type="dxa" w:w="2880"/>
+          </w:tcPr>
+          <w:p>
+            <w:r/>
+            <w:r>
+              <w:t>POS add-on; optional product_id links it to a recipe for stock deduction</w:t>
+            </w:r>
+          </w:p>
+        </w:tc>
+      </w:tr>
+      <w:tr>
+        <w:tc>
+          <w:tcPr>
+            <w:tcW w:type="dxa" w:w="2880"/>
+          </w:tcPr>
+          <w:p>
+            <w:r/>
+            <w:r>
+              <w:t>Kitchen ticket</w:t>
+            </w:r>
+          </w:p>
+        </w:tc>
+        <w:tc>
+          <w:tcPr>
+            <w:tcW w:type="dxa" w:w="2880"/>
+          </w:tcPr>
+          <w:p>
+            <w:r/>
+            <w:r>
+              <w:t>kitchen_tickets + kitchen_items</w:t>
+            </w:r>
+          </w:p>
+        </w:tc>
+        <w:tc>
+          <w:tcPr>
+            <w:tcW w:type="dxa" w:w="2880"/>
+          </w:tcPr>
+          <w:p>
+            <w:r/>
+            <w:r>
+              <w:t>"Send to Bar" order fed to the barista queue (KDS)</w:t>
+            </w:r>
+          </w:p>
+        </w:tc>
+      </w:tr>
+      <w:tr>
+        <w:tc>
+          <w:tcPr>
+            <w:tcW w:type="dxa" w:w="2880"/>
+          </w:tcPr>
+          <w:p>
+            <w:r/>
+            <w:r>
+              <w:t>Void log</w:t>
+            </w:r>
+          </w:p>
+        </w:tc>
+        <w:tc>
+          <w:tcPr>
+            <w:tcW w:type="dxa" w:w="2880"/>
+          </w:tcPr>
+          <w:p>
+            <w:r/>
+            <w:r>
+              <w:t>void_log</w:t>
+            </w:r>
+          </w:p>
+        </w:tc>
+        <w:tc>
+          <w:tcPr>
+            <w:tcW w:type="dxa" w:w="2880"/>
+          </w:tcPr>
+          <w:p>
+            <w:r/>
+            <w:r>
+              <w:t>Audit record of reversed sales (kept after the transaction itself is deleted)</w:t>
+            </w:r>
+          </w:p>
+        </w:tc>
+      </w:tr>
     </w:tbl>
     <w:p/>
     <w:p>
@@ -3060,6 +3817,9 @@
             <w:r>
               <w:t>id, transacted_at, payment_method, reference, notes, created_at</w:t>
             </w:r>
+            <w:r>
+              <w:t>, customer_id, points_earned, redeem_points, redeem_value, discount_pct, discount_amount, customer_note</w:t>
+            </w:r>
           </w:p>
         </w:tc>
       </w:tr>
@@ -3279,6 +4039,150 @@
           <w:p>
             <w:r>
               <w:t>code, name</w:t>
+            </w:r>
+          </w:p>
+        </w:tc>
+      </w:tr>
+      <w:tr>
+        <w:tc>
+          <w:tcPr>
+            <w:tcW w:type="dxa" w:w="4320"/>
+          </w:tcPr>
+          <w:p>
+            <w:r/>
+            <w:r>
+              <w:t>customers</w:t>
+            </w:r>
+          </w:p>
+        </w:tc>
+        <w:tc>
+          <w:tcPr>
+            <w:tcW w:type="dxa" w:w="4320"/>
+          </w:tcPr>
+          <w:p>
+            <w:r/>
+            <w:r>
+              <w:t>id, name, member_id, phone, email, points_balance, created_at, updated_at</w:t>
+            </w:r>
+          </w:p>
+        </w:tc>
+      </w:tr>
+      <w:tr>
+        <w:tc>
+          <w:tcPr>
+            <w:tcW w:type="dxa" w:w="4320"/>
+          </w:tcPr>
+          <w:p>
+            <w:r/>
+            <w:r>
+              <w:t>loyalty_config</w:t>
+            </w:r>
+          </w:p>
+        </w:tc>
+        <w:tc>
+          <w:tcPr>
+            <w:tcW w:type="dxa" w:w="4320"/>
+          </w:tcPr>
+          <w:p>
+            <w:r/>
+            <w:r>
+              <w:t>id (=1), earn_base, earn_points, redeem_rate, enabled, updated_at</w:t>
+            </w:r>
+          </w:p>
+        </w:tc>
+      </w:tr>
+      <w:tr>
+        <w:tc>
+          <w:tcPr>
+            <w:tcW w:type="dxa" w:w="4320"/>
+          </w:tcPr>
+          <w:p>
+            <w:r/>
+            <w:r>
+              <w:t>modifiers</w:t>
+            </w:r>
+          </w:p>
+        </w:tc>
+        <w:tc>
+          <w:tcPr>
+            <w:tcW w:type="dxa" w:w="4320"/>
+          </w:tcPr>
+          <w:p>
+            <w:r/>
+            <w:r>
+              <w:t>id, name, price_delta, active, product_id, created_at</w:t>
+            </w:r>
+          </w:p>
+        </w:tc>
+      </w:tr>
+      <w:tr>
+        <w:tc>
+          <w:tcPr>
+            <w:tcW w:type="dxa" w:w="4320"/>
+          </w:tcPr>
+          <w:p>
+            <w:r/>
+            <w:r>
+              <w:t>kitchen_tickets</w:t>
+            </w:r>
+          </w:p>
+        </w:tc>
+        <w:tc>
+          <w:tcPr>
+            <w:tcW w:type="dxa" w:w="4320"/>
+          </w:tcPr>
+          <w:p>
+            <w:r/>
+            <w:r>
+              <w:t>id, order_ref, table_label, order_type, status, created_at, updated_at</w:t>
+            </w:r>
+          </w:p>
+        </w:tc>
+      </w:tr>
+      <w:tr>
+        <w:tc>
+          <w:tcPr>
+            <w:tcW w:type="dxa" w:w="4320"/>
+          </w:tcPr>
+          <w:p>
+            <w:r/>
+            <w:r>
+              <w:t>kitchen_items</w:t>
+            </w:r>
+          </w:p>
+        </w:tc>
+        <w:tc>
+          <w:tcPr>
+            <w:tcW w:type="dxa" w:w="4320"/>
+          </w:tcPr>
+          <w:p>
+            <w:r/>
+            <w:r>
+              <w:t>id, ticket_id, product_id, name, qty, note</w:t>
+            </w:r>
+          </w:p>
+        </w:tc>
+      </w:tr>
+      <w:tr>
+        <w:tc>
+          <w:tcPr>
+            <w:tcW w:type="dxa" w:w="4320"/>
+          </w:tcPr>
+          <w:p>
+            <w:r/>
+            <w:r>
+              <w:t>void_log</w:t>
+            </w:r>
+          </w:p>
+        </w:tc>
+        <w:tc>
+          <w:tcPr>
+            <w:tcW w:type="dxa" w:w="4320"/>
+          </w:tcPr>
+          <w:p>
+            <w:r/>
+            <w:r>
+              <w:t>id, transaction_id, total, items, reason, restocked, voided_at</w:t>
             </w:r>
           </w:p>
         </w:tc>
@@ -5848,6 +6752,7 @@
             <w:tcW w:type="dxa" w:w="2880"/>
           </w:tcPr>
           <w:p>
+            <w:r/>
             <w:r>
               <w:t>List transactions with items (?date=)</w:t>
             </w:r>
@@ -5912,8 +6817,9 @@
             <w:tcW w:type="dxa" w:w="2880"/>
           </w:tcPr>
           <w:p>
-            <w:r>
-              <w:t>Create a POS transaction</w:t>
+            <w:r/>
+            <w:r>
+              <w:t>Create a POS transaction — now also accepts customer_id, discount_pct, redeem_points, and customer_note</w:t>
             </w:r>
           </w:p>
         </w:tc>
@@ -5976,8 +6882,9 @@
             <w:tcW w:type="dxa" w:w="2880"/>
           </w:tcPr>
           <w:p>
-            <w:r>
-              <w:t>Void a sale</w:t>
+            <w:r/>
+            <w:r>
+              <w:t>Void a sale. Body: { reason, restock }. restock=true returns ingredients to stock (order never made); restock=false leaves inventory consumed (comp/correction). Reverses loyalty points, logs to void_log, then deletes the transaction. Reachable from the POS (today's shift only) and from the Transactions drill-down (any historical order).</w:t>
             </w:r>
           </w:p>
         </w:tc>
@@ -7396,8 +8303,9 @@
             <w:tcW w:type="dxa" w:w="2880"/>
           </w:tcPr>
           <w:p>
-            <w:r>
-              <w:t>Import the POS "Riwayat Transaksi" export (.xls/.xlsx): groups rows into receipts, skips cancelled lines, fuzzy-matches product names, deducts inventory, skips already-imported receipts</w:t>
+            <w:r/>
+            <w:r>
+              <w:t>Import the POS "Riwayat Transaksi" export (.xls/.xlsx): groups rows into receipts, skips cancelled lines, fuzzy-matches product names, auto-creates a product for any name that still doesn't match (instead of skipping the sale), deducts inventory, skips already-imported receipts</w:t>
             </w:r>
           </w:p>
         </w:tc>
@@ -7468,6 +8376,353 @@
       </w:tr>
     </w:tbl>
     <w:p/>
+    <w:p>
+      <w:pPr>
+        <w:pStyle w:val="Heading2"/>
+      </w:pPr>
+      <w:r>
+        <w:rPr>
+          <w:color w:val="1F4E8C"/>
+        </w:rPr>
+        <w:t>7.11 Customers, Loyalty, Modifiers &amp; POS Support</w:t>
+      </w:r>
+    </w:p>
+    <w:tbl>
+      <w:tblPr>
+        <w:tblStyle w:val="LightGrid-Accent1"/>
+        <w:tblW w:type="auto" w:w="0"/>
+        <w:tblLook w:firstColumn="1" w:firstRow="1" w:lastColumn="0" w:lastRow="0" w:noHBand="0" w:noVBand="1" w:val="04A0"/>
+      </w:tblPr>
+      <w:tblGrid>
+        <w:gridCol w:w="2880"/>
+        <w:gridCol w:w="2880"/>
+        <w:gridCol w:w="2880"/>
+      </w:tblGrid>
+      <w:tr>
+        <w:tc>
+          <w:tcPr>
+            <w:tcW w:type="dxa" w:w="2880"/>
+          </w:tcPr>
+          <w:p>
+            <w:r/>
+            <w:r>
+              <w:rPr>
+                <w:b/>
+              </w:rPr>
+              <w:t>Method</w:t>
+            </w:r>
+          </w:p>
+        </w:tc>
+        <w:tc>
+          <w:tcPr>
+            <w:tcW w:type="dxa" w:w="2880"/>
+          </w:tcPr>
+          <w:p>
+            <w:r/>
+            <w:r>
+              <w:rPr>
+                <w:b/>
+              </w:rPr>
+              <w:t>Path</w:t>
+            </w:r>
+          </w:p>
+        </w:tc>
+        <w:tc>
+          <w:tcPr>
+            <w:tcW w:type="dxa" w:w="2880"/>
+          </w:tcPr>
+          <w:p>
+            <w:r/>
+            <w:r>
+              <w:rPr>
+                <w:b/>
+              </w:rPr>
+              <w:t>Description</w:t>
+            </w:r>
+          </w:p>
+        </w:tc>
+      </w:tr>
+      <w:tr>
+        <w:tc>
+          <w:tcPr>
+            <w:tcW w:type="dxa" w:w="2880"/>
+          </w:tcPr>
+          <w:p>
+            <w:r/>
+            <w:r>
+              <w:t>GET/POST/PUT/DELETE</w:t>
+            </w:r>
+          </w:p>
+        </w:tc>
+        <w:tc>
+          <w:tcPr>
+            <w:tcW w:type="dxa" w:w="2880"/>
+          </w:tcPr>
+          <w:p>
+            <w:r/>
+            <w:r>
+              <w:t>/api/customers[/:id]</w:t>
+            </w:r>
+          </w:p>
+        </w:tc>
+        <w:tc>
+          <w:tcPr>
+            <w:tcW w:type="dxa" w:w="2880"/>
+          </w:tcPr>
+          <w:p>
+            <w:r/>
+            <w:r>
+              <w:t>Customer directory: list/search (?member_id=, ?q=), detail, create (auto-generates a 5-digit member_id if omitted), update, delete (blocked if the customer has transactions)</w:t>
+            </w:r>
+          </w:p>
+        </w:tc>
+      </w:tr>
+      <w:tr>
+        <w:tc>
+          <w:tcPr>
+            <w:tcW w:type="dxa" w:w="2880"/>
+          </w:tcPr>
+          <w:p>
+            <w:r/>
+            <w:r>
+              <w:t>GET</w:t>
+            </w:r>
+          </w:p>
+        </w:tc>
+        <w:tc>
+          <w:tcPr>
+            <w:tcW w:type="dxa" w:w="2880"/>
+          </w:tcPr>
+          <w:p>
+            <w:r/>
+            <w:r>
+              <w:t>/api/loyalty-config</w:t>
+            </w:r>
+          </w:p>
+        </w:tc>
+        <w:tc>
+          <w:tcPr>
+            <w:tcW w:type="dxa" w:w="2880"/>
+          </w:tcPr>
+          <w:p>
+            <w:r/>
+            <w:r>
+              <w:t>Read the earn/redeem rules (staff-readable so the POS can preview points)</w:t>
+            </w:r>
+          </w:p>
+        </w:tc>
+      </w:tr>
+      <w:tr>
+        <w:tc>
+          <w:tcPr>
+            <w:tcW w:type="dxa" w:w="2880"/>
+          </w:tcPr>
+          <w:p>
+            <w:r/>
+            <w:r>
+              <w:t>PUT</w:t>
+            </w:r>
+          </w:p>
+        </w:tc>
+        <w:tc>
+          <w:tcPr>
+            <w:tcW w:type="dxa" w:w="2880"/>
+          </w:tcPr>
+          <w:p>
+            <w:r/>
+            <w:r>
+              <w:t>/api/loyalty-config</w:t>
+            </w:r>
+          </w:p>
+        </w:tc>
+        <w:tc>
+          <w:tcPr>
+            <w:tcW w:type="dxa" w:w="2880"/>
+          </w:tcPr>
+          <w:p>
+            <w:r/>
+            <w:r>
+              <w:t>Edit earn_base / earn_points / redeem_rate / enabled (admin/manager only)</w:t>
+            </w:r>
+          </w:p>
+        </w:tc>
+      </w:tr>
+      <w:tr>
+        <w:tc>
+          <w:tcPr>
+            <w:tcW w:type="dxa" w:w="2880"/>
+          </w:tcPr>
+          <w:p>
+            <w:r/>
+            <w:r>
+              <w:t>GET/POST/PUT/DELETE</w:t>
+            </w:r>
+          </w:p>
+        </w:tc>
+        <w:tc>
+          <w:tcPr>
+            <w:tcW w:type="dxa" w:w="2880"/>
+          </w:tcPr>
+          <w:p>
+            <w:r/>
+            <w:r>
+              <w:t>/api/modifiers[/:id]</w:t>
+            </w:r>
+          </w:p>
+        </w:tc>
+        <w:tc>
+          <w:tcPr>
+            <w:tcW w:type="dxa" w:w="2880"/>
+          </w:tcPr>
+          <w:p>
+            <w:r/>
+            <w:r>
+              <w:t>POS add-ons (e.g. "Extra Shot"): list active, create/update (name, price_delta, optional product_id to deduct that product's recipe), delete soft-disables</w:t>
+            </w:r>
+          </w:p>
+        </w:tc>
+      </w:tr>
+      <w:tr>
+        <w:tc>
+          <w:tcPr>
+            <w:tcW w:type="dxa" w:w="2880"/>
+          </w:tcPr>
+          <w:p>
+            <w:r/>
+            <w:r>
+              <w:t>GET/POST/PATCH/DELETE</w:t>
+            </w:r>
+          </w:p>
+        </w:tc>
+        <w:tc>
+          <w:tcPr>
+            <w:tcW w:type="dxa" w:w="2880"/>
+          </w:tcPr>
+          <w:p>
+            <w:r/>
+            <w:r>
+              <w:t>/api/kitchen[/:id]</w:t>
+            </w:r>
+          </w:p>
+        </w:tc>
+        <w:tc>
+          <w:tcPr>
+            <w:tcW w:type="dxa" w:w="2880"/>
+          </w:tcPr>
+          <w:p>
+            <w:r/>
+            <w:r>
+              <w:t>Barista ticket queue (KDS): list (?status=), send/update/cancel a ticket ("Send to Bar"), advance status (new→preparing→ready→served/cancelled), remove</w:t>
+            </w:r>
+          </w:p>
+        </w:tc>
+      </w:tr>
+      <w:tr>
+        <w:tc>
+          <w:tcPr>
+            <w:tcW w:type="dxa" w:w="2880"/>
+          </w:tcPr>
+          <w:p>
+            <w:r/>
+            <w:r>
+              <w:t>GET</w:t>
+            </w:r>
+          </w:p>
+        </w:tc>
+        <w:tc>
+          <w:tcPr>
+            <w:tcW w:type="dxa" w:w="2880"/>
+          </w:tcPr>
+          <w:p>
+            <w:r/>
+            <w:r>
+              <w:t>/api/pos-ingredients</w:t>
+            </w:r>
+          </w:p>
+        </w:tc>
+        <w:tc>
+          <w:tcPr>
+            <w:tcW w:type="dxa" w:w="2880"/>
+          </w:tcPr>
+          <w:p>
+            <w:r/>
+            <w:r>
+              <w:t>Read-only ingredient list (id, name, unit, cost) for the POS custom-item recipe builder — staff-safe subset of /api/ingredients</w:t>
+            </w:r>
+          </w:p>
+        </w:tc>
+      </w:tr>
+      <w:tr>
+        <w:tc>
+          <w:tcPr>
+            <w:tcW w:type="dxa" w:w="2880"/>
+          </w:tcPr>
+          <w:p>
+            <w:r/>
+            <w:r>
+              <w:t>GET</w:t>
+            </w:r>
+          </w:p>
+        </w:tc>
+        <w:tc>
+          <w:tcPr>
+            <w:tcW w:type="dxa" w:w="2880"/>
+          </w:tcPr>
+          <w:p>
+            <w:r/>
+            <w:r>
+              <w:t>/api/pos-category-sales</w:t>
+            </w:r>
+          </w:p>
+        </w:tc>
+        <w:tc>
+          <w:tcPr>
+            <w:tcW w:type="dxa" w:w="2880"/>
+          </w:tcPr>
+          <w:p>
+            <w:r/>
+            <w:r>
+              <w:t>Total quantity sold per product category, so the POS orders category chips most-sold first</w:t>
+            </w:r>
+          </w:p>
+        </w:tc>
+      </w:tr>
+      <w:tr>
+        <w:tc>
+          <w:tcPr>
+            <w:tcW w:type="dxa" w:w="2880"/>
+          </w:tcPr>
+          <w:p>
+            <w:r/>
+            <w:r>
+              <w:t>GET</w:t>
+            </w:r>
+          </w:p>
+        </w:tc>
+        <w:tc>
+          <w:tcPr>
+            <w:tcW w:type="dxa" w:w="2880"/>
+          </w:tcPr>
+          <w:p>
+            <w:r/>
+            <w:r>
+              <w:t>/api/qr?text=&amp;format=</w:t>
+            </w:r>
+          </w:p>
+        </w:tc>
+        <w:tc>
+          <w:tcPr>
+            <w:tcW w:type="dxa" w:w="2880"/>
+          </w:tcPr>
+          <w:p>
+            <w:r/>
+            <w:r>
+              <w:t>Renders a QR code for the receipt screen — PNG image (format=png) or a data URL</w:t>
+            </w:r>
+          </w:p>
+        </w:tc>
+      </w:tr>
+    </w:tbl>
     <w:p>
       <w:pPr>
         <w:pStyle w:val="Heading1"/>
@@ -7786,6 +9041,111 @@
           <w:p>
             <w:r>
               <w:t>PWA support: installable on phones/tablets via manifest + minimal service worker (static shell only, never caches pages/API data). Dashboard: full drill-down drawer ported from Analytics (all KPI cards, top products, daily chart bars clickable; Revenue drills monthly -&gt; by-day summary -&gt; orders -&gt; line items) with real back navigation. Added Today-vs-Yesterday live comparison and a Stock Alerts panel rendering low/out-of-stock ingredients as a severity heatmap prioritized by whether they feed a top-10 seller. Fixed /api/reports/daily grouping by full timestamp instead of calendar date (was producing one chart bar per transaction and breaking the day drill-down).</w:t>
+            </w:r>
+          </w:p>
+        </w:tc>
+      </w:tr>
+      <w:tr>
+        <w:tc>
+          <w:tcPr>
+            <w:tcW w:type="dxa" w:w="2880"/>
+          </w:tcPr>
+          <w:p>
+            <w:r/>
+            <w:r>
+              <w:t>0.9.0</w:t>
+            </w:r>
+          </w:p>
+        </w:tc>
+        <w:tc>
+          <w:tcPr>
+            <w:tcW w:type="dxa" w:w="2880"/>
+          </w:tcPr>
+          <w:p>
+            <w:r/>
+            <w:r>
+              <w:t>2026-07-14</w:t>
+            </w:r>
+          </w:p>
+        </w:tc>
+        <w:tc>
+          <w:tcPr>
+            <w:tcW w:type="dxa" w:w="2880"/>
+          </w:tcPr>
+          <w:p>
+            <w:r/>
+            <w:r>
+              <w:t>Dedicated Transactions page (list/search/filter/sort with an order drill-down). Stock Alert tiles now drill into ingredient detail and can act on it directly. Recent Movements moved to its own full-width column/row with a source (sale/purchase) filter. Riwayat import auto-creates a product for any name it still can't match, instead of skipping that sale.</w:t>
+            </w:r>
+          </w:p>
+        </w:tc>
+      </w:tr>
+      <w:tr>
+        <w:tc>
+          <w:tcPr>
+            <w:tcW w:type="dxa" w:w="2880"/>
+          </w:tcPr>
+          <w:p>
+            <w:r/>
+            <w:r>
+              <w:t>0.10.0</w:t>
+            </w:r>
+          </w:p>
+        </w:tc>
+        <w:tc>
+          <w:tcPr>
+            <w:tcW w:type="dxa" w:w="2880"/>
+          </w:tcPr>
+          <w:p>
+            <w:r/>
+            <w:r>
+              <w:t>2026-07-15</w:t>
+            </w:r>
+          </w:p>
+        </w:tc>
+        <w:tc>
+          <w:tcPr>
+            <w:tcW w:type="dxa" w:w="2880"/>
+          </w:tcPr>
+          <w:p>
+            <w:r/>
+            <w:r>
+              <w:t>Stock Adjustment split out of Inventory into its own page: KPI cards, a highlighted ingredient picker with a Category column, and cross-highlighting with the movement list. POS modifiers API implemented (was a stub returning []) + seeded "Extra Shot"; POS checkout now folds modifier prices into the recorded sale and Void is real (was previously incomplete). Added the New POS concept (/pos/ui/1/register): a full register UI — cart, "Send to Bar" kitchen tickets, tablet/phone layouts — ported from an earlier prototype for side-by-side comparison with /pos.html.</w:t>
+            </w:r>
+          </w:p>
+        </w:tc>
+      </w:tr>
+      <w:tr>
+        <w:tc>
+          <w:tcPr>
+            <w:tcW w:type="dxa" w:w="2880"/>
+          </w:tcPr>
+          <w:p>
+            <w:r/>
+            <w:r>
+              <w:t>0.11.0</w:t>
+            </w:r>
+          </w:p>
+        </w:tc>
+        <w:tc>
+          <w:tcPr>
+            <w:tcW w:type="dxa" w:w="2880"/>
+          </w:tcPr>
+          <w:p>
+            <w:r/>
+            <w:r>
+              <w:t>2026-07-16</w:t>
+            </w:r>
+          </w:p>
+        </w:tc>
+        <w:tc>
+          <w:tcPr>
+            <w:tcW w:type="dxa" w:w="2880"/>
+          </w:tcPr>
+          <w:p>
+            <w:r/>
+            <w:r>
+              <w:t>New POS became the primary POS (linked from the sidebar), with on-the-fly custom-item recipes, sales-ranked category chips, and modifiers that deduct their linked product's recipe from inventory. Added customers &amp; a loyalty program (auto member IDs, points earn/redeem, editable Loyalty Setup replacing hardcoded rates), an inline redemption flow, and a discount keypad with whole-order discount applied at Payment. Replaced the per-line order note with one customer_note per transaction. Redesigned Void with an explicit restock-vs-keep-inventory choice plus a required reason, recorded to a new void_log audit trail; added a direct Void action to the Transactions drill-down so any historical order can be voided, not just today's shift.</w:t>
             </w:r>
           </w:p>
         </w:tc>

</xml_diff>

<commit_message>
Docs: functional spec v0.12.0 — Riwayat overhaul, order types, sidebar
Version bump + 0.12.0 history entry, migrations 025-027, the Order Types page,
and the /api/order-types endpoints added to the functional spec.

Co-Authored-By: Claude Sonnet 5 <noreply@anthropic.com>
</commit_message>
<xml_diff>
--- a/docs/8NewLight_Functional_Spec.docx
+++ b/docs/8NewLight_Functional_Spec.docx
@@ -25,13 +25,13 @@
     <w:p>
       <w:r/>
       <w:r>
-        <w:t>Version 0.11.0</w:t>
+        <w:t>Version 0.12.0</w:t>
         <w:br/>
-        <w:t>Date: 2026-07-16</w:t>
+        <w:t>Date: 2026-07-18</w:t>
         <w:br/>
         <w:t>Project: thumbaz_8newlight_codewhale</w:t>
         <w:br/>
-        <w:t>Scope: Complete specification of the deployed back-office system (menu, ingredients, recipes, purchasing, inventory, POS/sales, employees, expenses, budgeting, and analytics, POS register/kitchen/modifiers, customers &amp; loyalty).</w:t>
+        <w:t>Scope: Complete specification of the deployed back-office system (menu, ingredients, recipes, purchasing, inventory, POS/sales, employees, expenses, budgeting, and analytics, POS register/kitchen/modifiers, customers &amp; loyalty, order types &amp; delivery charges).</w:t>
       </w:r>
     </w:p>
     <w:p/>
@@ -1588,6 +1588,48 @@
           <w:p>
             <w:r>
               <w:t>PIN authentication</w:t>
+            </w:r>
+          </w:p>
+        </w:tc>
+      </w:tr>
+      <w:tr>
+        <w:tc>
+          <w:tcPr>
+            <w:tcW w:type="dxa" w:w="2160"/>
+          </w:tcPr>
+          <w:p>
+            <w:r>
+              <w:t>POS</w:t>
+            </w:r>
+          </w:p>
+        </w:tc>
+        <w:tc>
+          <w:tcPr>
+            <w:tcW w:type="dxa" w:w="2160"/>
+          </w:tcPr>
+          <w:p>
+            <w:r>
+              <w:t>Order Types</w:t>
+            </w:r>
+          </w:p>
+        </w:tc>
+        <w:tc>
+          <w:tcPr>
+            <w:tcW w:type="dxa" w:w="2160"/>
+          </w:tcPr>
+          <w:p>
+            <w:r>
+              <w:t>/order-types.html</w:t>
+            </w:r>
+          </w:p>
+        </w:tc>
+        <w:tc>
+          <w:tcPr>
+            <w:tcW w:type="dxa" w:w="2160"/>
+          </w:tcPr>
+          <w:p>
+            <w:r>
+              <w:t>Manage order types and per-item delivery charges (Grab Food / Go Food); managers add/edit/disable</w:t>
             </w:r>
           </w:p>
         </w:tc>
@@ -2441,6 +2483,102 @@
             <w:r/>
             <w:r>
               <w:t>transactions.discount_pct / discount_amount — whole-order discount applied at Payment</w:t>
+            </w:r>
+          </w:p>
+        </w:tc>
+      </w:tr>
+      <w:tr>
+        <w:tc>
+          <w:tcPr>
+            <w:tcW w:type="dxa" w:w="2880"/>
+          </w:tcPr>
+          <w:p>
+            <w:r>
+              <w:t>025</w:t>
+            </w:r>
+          </w:p>
+        </w:tc>
+        <w:tc>
+          <w:tcPr>
+            <w:tcW w:type="dxa" w:w="2880"/>
+          </w:tcPr>
+          <w:p>
+            <w:r>
+              <w:t>void_log_reference</w:t>
+            </w:r>
+          </w:p>
+        </w:tc>
+        <w:tc>
+          <w:tcPr>
+            <w:tcW w:type="dxa" w:w="2880"/>
+          </w:tcPr>
+          <w:p>
+            <w:r>
+              <w:t>void_log.reference — links a void to its originating Riwayat receipt so a re-import of the same file does not recreate it</w:t>
+            </w:r>
+          </w:p>
+        </w:tc>
+      </w:tr>
+      <w:tr>
+        <w:tc>
+          <w:tcPr>
+            <w:tcW w:type="dxa" w:w="2880"/>
+          </w:tcPr>
+          <w:p>
+            <w:r>
+              <w:t>026</w:t>
+            </w:r>
+          </w:p>
+        </w:tc>
+        <w:tc>
+          <w:tcPr>
+            <w:tcW w:type="dxa" w:w="2880"/>
+          </w:tcPr>
+          <w:p>
+            <w:r>
+              <w:t>riwayat_full_columns</w:t>
+            </w:r>
+          </w:p>
+        </w:tc>
+        <w:tc>
+          <w:tcPr>
+            <w:tcW w:type="dxa" w:w="2880"/>
+          </w:tcPr>
+          <w:p>
+            <w:r>
+              <w:t>transactions + transaction_items columns for the full Riwayat export: cashier, customer, order type, source discounts, service fee, tax, points, references, and per-line status/original/cancelled quantity</w:t>
+            </w:r>
+          </w:p>
+        </w:tc>
+      </w:tr>
+      <w:tr>
+        <w:tc>
+          <w:tcPr>
+            <w:tcW w:type="dxa" w:w="2880"/>
+          </w:tcPr>
+          <w:p>
+            <w:r>
+              <w:t>027</w:t>
+            </w:r>
+          </w:p>
+        </w:tc>
+        <w:tc>
+          <w:tcPr>
+            <w:tcW w:type="dxa" w:w="2880"/>
+          </w:tcPr>
+          <w:p>
+            <w:r>
+              <w:t>order_types</w:t>
+            </w:r>
+          </w:p>
+        </w:tc>
+        <w:tc>
+          <w:tcPr>
+            <w:tcW w:type="dxa" w:w="2880"/>
+          </w:tcPr>
+          <w:p>
+            <w:r>
+              <w:t>order_types table: manageable order types with a per-item delivery charge (Grab Food / Go Food)</w:t>
             </w:r>
           </w:p>
         </w:tc>
@@ -8722,6 +8860,70 @@
           </w:p>
         </w:tc>
       </w:tr>
+      <w:tr>
+        <w:tc>
+          <w:tcPr>
+            <w:tcW w:type="dxa" w:w="2880"/>
+          </w:tcPr>
+          <w:p>
+            <w:r>
+              <w:t>GET</w:t>
+            </w:r>
+          </w:p>
+        </w:tc>
+        <w:tc>
+          <w:tcPr>
+            <w:tcW w:type="dxa" w:w="2880"/>
+          </w:tcPr>
+          <w:p>
+            <w:r>
+              <w:t>/api/order-types</w:t>
+            </w:r>
+          </w:p>
+        </w:tc>
+        <w:tc>
+          <w:tcPr>
+            <w:tcW w:type="dxa" w:w="2880"/>
+          </w:tcPr>
+          <w:p>
+            <w:r>
+              <w:t>List order types for the POS (staff); ?all=1 includes disabled ones (manager)</w:t>
+            </w:r>
+          </w:p>
+        </w:tc>
+      </w:tr>
+      <w:tr>
+        <w:tc>
+          <w:tcPr>
+            <w:tcW w:type="dxa" w:w="2880"/>
+          </w:tcPr>
+          <w:p>
+            <w:r>
+              <w:t>POST/PUT/DELETE</w:t>
+            </w:r>
+          </w:p>
+        </w:tc>
+        <w:tc>
+          <w:tcPr>
+            <w:tcW w:type="dxa" w:w="2880"/>
+          </w:tcPr>
+          <w:p>
+            <w:r>
+              <w:t>/api/order-types[/:id]</w:t>
+            </w:r>
+          </w:p>
+        </w:tc>
+        <w:tc>
+          <w:tcPr>
+            <w:tcW w:type="dxa" w:w="2880"/>
+          </w:tcPr>
+          <w:p>
+            <w:r>
+              <w:t>Manager: add / edit / soft-disable order types and their per-item charge</w:t>
+            </w:r>
+          </w:p>
+        </w:tc>
+      </w:tr>
     </w:tbl>
     <w:p>
       <w:pPr>
@@ -9146,6 +9348,38 @@
             <w:r/>
             <w:r>
               <w:t>New POS became the primary POS (linked from the sidebar), with on-the-fly custom-item recipes, sales-ranked category chips, and modifiers that deduct their linked product's recipe from inventory. Added customers &amp; a loyalty program (auto member IDs, points earn/redeem, editable Loyalty Setup replacing hardcoded rates), an inline redemption flow, and a discount keypad with whole-order discount applied at Payment. Replaced the per-line order note with one customer_note per transaction. Redesigned Void with an explicit restock-vs-keep-inventory choice plus a required reason, recorded to a new void_log audit trail; added a direct Void action to the Transactions drill-down so any historical order can be voided, not just today's shift.</w:t>
+            </w:r>
+          </w:p>
+        </w:tc>
+      </w:tr>
+      <w:tr>
+        <w:tc>
+          <w:tcPr>
+            <w:tcW w:type="dxa" w:w="2880"/>
+          </w:tcPr>
+          <w:p>
+            <w:r>
+              <w:t>0.12.0</w:t>
+            </w:r>
+          </w:p>
+        </w:tc>
+        <w:tc>
+          <w:tcPr>
+            <w:tcW w:type="dxa" w:w="2880"/>
+          </w:tcPr>
+          <w:p>
+            <w:r>
+              <w:t>2026-07-18</w:t>
+            </w:r>
+          </w:p>
+        </w:tc>
+        <w:tc>
+          <w:tcPr>
+            <w:tcW w:type="dxa" w:w="2880"/>
+          </w:tcPr>
+          <w:p>
+            <w:r>
+              <w:t>Riwayat import overhaul: revenue now taken from the discount-aware Total column (was the pre-discount subtotal, which overstated any discounted receipt); the full export is captured — cashier, customer, order type, per-line &amp; per-receipt discounts, service fee, tax, points redeemed, references, and per-line status/original/cancelled quantity (migration 026). Cancelled receipts are kept as live, status-flagged transactions instead of record-then-void. The product matcher resolves air/es/aires -&gt; Air Es and bare NewLight Latte -&gt; Hot, and splits "X, Extra Shot" into base + Extra Shot Espresso so both recipes deduct from stock. Transactions page: the Payment filter is replaced by a data-driven Order Type filter, with Order Type / Status / Discount / Tax columns that hide when the view has no data for them. New data-driven Order Types (migration 027, /api/order-types, Order Types page): delivery platforms (Grab Food / Go Food) carry a manageable per-item charge the POS auto-applies as a revenue-reducing discount. Sidebar reorganised into a POS group (Register / Kitchen / Order Types / Customers / Loyalty Setup); People renamed Employee; new Setup group (Users / Import Center).</w:t>
             </w:r>
           </w:p>
         </w:tc>

</xml_diff>

<commit_message>
docs: spec v0.13.0 — native Android printing, Printer Setup page docs
Adds the missing Printer Setup page to the Pages table and a Version
History entry covering the native Bluetooth print method and the
Transactions pager fix.

Co-Authored-By: Claude Sonnet 5 <noreply@anthropic.com>
</commit_message>
<xml_diff>
--- a/docs/8NewLight_Functional_Spec.docx
+++ b/docs/8NewLight_Functional_Spec.docx
@@ -1630,6 +1630,48 @@
           <w:p>
             <w:r>
               <w:t>Manage order types and per-item delivery charges (Grab Food / Go Food); managers add/edit/disable</w:t>
+            </w:r>
+          </w:p>
+        </w:tc>
+      </w:tr>
+      <w:tr>
+        <w:tc>
+          <w:tcPr>
+            <w:tcW w:type="dxa" w:w="2160"/>
+          </w:tcPr>
+          <w:p>
+            <w:r>
+              <w:t>POS</w:t>
+            </w:r>
+          </w:p>
+        </w:tc>
+        <w:tc>
+          <w:tcPr>
+            <w:tcW w:type="dxa" w:w="2160"/>
+          </w:tcPr>
+          <w:p>
+            <w:r>
+              <w:t>Printer</w:t>
+            </w:r>
+          </w:p>
+        </w:tc>
+        <w:tc>
+          <w:tcPr>
+            <w:tcW w:type="dxa" w:w="2160"/>
+          </w:tcPr>
+          <w:p>
+            <w:r>
+              <w:t>/printer-setup.html</w:t>
+            </w:r>
+          </w:p>
+        </w:tc>
+        <w:tc>
+          <w:tcPr>
+            <w:tcW w:type="dxa" w:w="2160"/>
+          </w:tcPr>
+          <w:p>
+            <w:r>
+              <w:t>Pair the Bluetooth receipt printer once; three print methods to choose from (Native app printing via the Android wrapper’s own Bluetooth stack — recommended when running inside that app; RawBT bridge app; or direct Web Bluetooth in Chrome). Shows live paired-printer status with Test print + Forget.</w:t>
             </w:r>
           </w:p>
         </w:tc>
@@ -9380,6 +9422,38 @@
           <w:p>
             <w:r>
               <w:t>Riwayat import overhaul: revenue now taken from the discount-aware Total column (was the pre-discount subtotal, which overstated any discounted receipt); the full export is captured — cashier, customer, order type, per-line &amp; per-receipt discounts, service fee, tax, points redeemed, references, and per-line status/original/cancelled quantity (migration 026). Cancelled receipts are kept as live, status-flagged transactions instead of record-then-void. The product matcher resolves air/es/aires -&gt; Air Es and bare NewLight Latte -&gt; Hot, and splits "X, Extra Shot" into base + Extra Shot Espresso so both recipes deduct from stock. Transactions page: the Payment filter is replaced by a data-driven Order Type filter, with Order Type / Status / Discount / Tax columns that hide when the view has no data for them. New data-driven Order Types (migration 027, /api/order-types, Order Types page): delivery platforms (Grab Food / Go Food) carry a manageable per-item charge the POS auto-applies as a revenue-reducing discount. Sidebar reorganised into a POS group (Register / Kitchen / Order Types / Customers / Loyalty Setup); People renamed Employee; new Setup group (Users / Import Center).</w:t>
+            </w:r>
+          </w:p>
+        </w:tc>
+      </w:tr>
+      <w:tr>
+        <w:tc>
+          <w:tcPr>
+            <w:tcW w:type="dxa" w:w="2880"/>
+          </w:tcPr>
+          <w:p>
+            <w:r>
+              <w:t>0.13.0</w:t>
+            </w:r>
+          </w:p>
+        </w:tc>
+        <w:tc>
+          <w:tcPr>
+            <w:tcW w:type="dxa" w:w="2880"/>
+          </w:tcPr>
+          <w:p>
+            <w:r>
+              <w:t>2026-07-20</w:t>
+            </w:r>
+          </w:p>
+        </w:tc>
+        <w:tc>
+          <w:tcPr>
+            <w:tcW w:type="dxa" w:w="2880"/>
+          </w:tcPr>
+          <w:p>
+            <w:r>
+              <w:t>Printing: added a native Android Bluetooth print method — the WebView wrapper app talks to the printer directly through Android’s own Bluetooth stack via a window.AndroidPrinter bridge, avoiding Chrome Web Bluetooth’s reconnect flakiness and needing no separate app. It’s auto-selected as the default when running inside the wrapper app; Printer Setup now offers all three methods (Native / RawBT / Web Bluetooth) and documents the page for the first time. Fixed the Transactions page’s Next/Prev pager buttons rendering white text on a white background (unreadable).</w:t>
             </w:r>
           </w:p>
         </w:tc>

</xml_diff>

<commit_message>
docs: spec v0.14.0 — staff-role route fix + Android camera fix
Updates §1.3 roles text/table, the attendance and sales API tables
(new /api/attendance/employees row, manager-only annotations on
payroll/history), and POS support table (new /api/pos-products row)
to match the staff permission fix, plus a Version History entry.

Co-Authored-By: Claude Sonnet 5 <noreply@anthropic.com>
</commit_message>
<xml_diff>
--- a/docs/8NewLight_Functional_Spec.docx
+++ b/docs/8NewLight_Functional_Spec.docx
@@ -438,11 +438,7 @@
     </w:p>
     <w:p>
       <w:r>
-        <w:rPr>
-          <w:b w:val="0"/>
-          <w:i w:val="0"/>
-        </w:rPr>
-        <w:t>Three roles are enforced by the requireRole middleware. Most back-office APIs are gated to admin+manager ("manager" guard). Staff additionally reach a POS-scoped set — /api/modifiers, /api/kitchen, /api/pos-ingredients, /api/pos-category-sales, /api/customers, /api/loyalty-config, /api/qr — so the register, kitchen board, and loyalty lookups work without a manager login; everything else still returns 401/403.</w:t>
+        <w:t>Three roles are enforced by the requireRole middleware. Most back-office APIs are gated to admin+manager ("manager" guard). Staff additionally reach a POS-scoped set — /api/sales (checkout, void), /api/attendance (clock in/out + today; payroll and full history stay manager-only), /api/modifiers, /api/kitchen, /api/pos-products, /api/pos-ingredients, /api/pos-category-sales, /api/customers, /api/loyalty-config, /api/order-types, /api/qr — so the register, checkout, kitchen board, clock-in, and loyalty lookups all work without a manager login; everything else still returns 401/403. Where a manager-only route carries sensitive fields (cost/margin on products, pay rate on users), staff get a separate lean route instead of a widened one (/api/pos-products, /api/attendance/employees) rather than exposing the full record.</w:t>
       </w:r>
     </w:p>
     <w:tbl>
@@ -580,20 +576,18 @@
             <w:tcW w:type="dxa" w:w="2880"/>
           </w:tcPr>
           <w:p>
-            <w:r/>
-            <w:r>
-              <w:t>Login + POS register (cart, kitchen tickets, modifiers, customer/loyalty lookup) + attendance (clock in/out)</w:t>
-            </w:r>
-          </w:p>
-        </w:tc>
-        <w:tc>
-          <w:tcPr>
-            <w:tcW w:type="dxa" w:w="2880"/>
-          </w:tcPr>
-          <w:p>
-            <w:r/>
-            <w:r>
-              <w:t>Landing page is the New POS register (/pos/ui/1/register); manager-gated back-office pages/APIs still return 401/403</w:t>
+            <w:r>
+              <w:t>Login + POS register/checkout (cart, kitchen tickets, modifiers, customer/loyalty lookup, void) + attendance (clock in/out)</w:t>
+            </w:r>
+          </w:p>
+        </w:tc>
+        <w:tc>
+          <w:tcPr>
+            <w:tcW w:type="dxa" w:w="2880"/>
+          </w:tcPr>
+          <w:p>
+            <w:r>
+              <w:t>Landing page is the New POS register (/pos/ui/1/register); manager-gated back-office pages/APIs (payroll, full attendance history, cost data, reports) still return 401/403</w:t>
             </w:r>
           </w:p>
         </w:tc>
@@ -7031,7 +7025,7 @@
           </w:tcPr>
           <w:p>
             <w:r>
-              <w:t>List / create sales</w:t>
+              <w:t>List / create sales — staff-reachable (POS checkout)</w:t>
             </w:r>
           </w:p>
         </w:tc>
@@ -7062,9 +7056,8 @@
             <w:tcW w:type="dxa" w:w="2880"/>
           </w:tcPr>
           <w:p>
-            <w:r/>
-            <w:r>
-              <w:t>Void a sale. Body: { reason, restock }. restock=true returns ingredients to stock (order never made); restock=false leaves inventory consumed (comp/correction). Reverses loyalty points, logs to void_log, then deletes the transaction. Reachable from the POS (today's shift only) and from the Transactions drill-down (any historical order).</w:t>
+            <w:r>
+              <w:t>Void a sale. Body: { reason, restock }. restock=true returns ingredients to stock (order never made); restock=false leaves inventory consumed (comp/correction). Reverses loyalty points, logs to void_log, then deletes the transaction. Reachable from the POS (today's shift only) and from the Transactions drill-down (any historical order). Staff-reachable from the POS; the Transactions drill-down itself is manager-only.</w:t>
             </w:r>
           </w:p>
         </w:tc>
@@ -7282,17 +7275,17 @@
           </w:tcPr>
           <w:p>
             <w:r>
-              <w:t>/api/attendance/today</w:t>
-            </w:r>
-          </w:p>
-        </w:tc>
-        <w:tc>
-          <w:tcPr>
-            <w:tcW w:type="dxa" w:w="2880"/>
-          </w:tcPr>
-          <w:p>
-            <w:r>
-              <w:t>Today's attendance</w:t>
+              <w:t>/api/attendance/employees</w:t>
+            </w:r>
+          </w:p>
+        </w:tc>
+        <w:tc>
+          <w:tcPr>
+            <w:tcW w:type="dxa" w:w="2880"/>
+          </w:tcPr>
+          <w:p>
+            <w:r>
+              <w:t>Minimal id+name list of active employees for the clock-in picker (staff-safe subset of /api/users, no pay rate)</w:t>
             </w:r>
           </w:p>
         </w:tc>
@@ -7304,27 +7297,27 @@
           </w:tcPr>
           <w:p>
             <w:r>
-              <w:t>POST</w:t>
-            </w:r>
-          </w:p>
-        </w:tc>
-        <w:tc>
-          <w:tcPr>
-            <w:tcW w:type="dxa" w:w="2880"/>
-          </w:tcPr>
-          <w:p>
-            <w:r>
-              <w:t>/api/attendance/clock-in</w:t>
-            </w:r>
-          </w:p>
-        </w:tc>
-        <w:tc>
-          <w:tcPr>
-            <w:tcW w:type="dxa" w:w="2880"/>
-          </w:tcPr>
-          <w:p>
-            <w:r>
-              <w:t>Clock in (with photo)</w:t>
+              <w:t>GET</w:t>
+            </w:r>
+          </w:p>
+        </w:tc>
+        <w:tc>
+          <w:tcPr>
+            <w:tcW w:type="dxa" w:w="2880"/>
+          </w:tcPr>
+          <w:p>
+            <w:r>
+              <w:t>/api/attendance/today</w:t>
+            </w:r>
+          </w:p>
+        </w:tc>
+        <w:tc>
+          <w:tcPr>
+            <w:tcW w:type="dxa" w:w="2880"/>
+          </w:tcPr>
+          <w:p>
+            <w:r>
+              <w:t>Today's attendance</w:t>
             </w:r>
           </w:p>
         </w:tc>
@@ -7346,17 +7339,17 @@
           </w:tcPr>
           <w:p>
             <w:r>
-              <w:t>/api/attendance/clock-out</w:t>
-            </w:r>
-          </w:p>
-        </w:tc>
-        <w:tc>
-          <w:tcPr>
-            <w:tcW w:type="dxa" w:w="2880"/>
-          </w:tcPr>
-          <w:p>
-            <w:r>
-              <w:t>Clock out</w:t>
+              <w:t>/api/attendance/clock-in</w:t>
+            </w:r>
+          </w:p>
+        </w:tc>
+        <w:tc>
+          <w:tcPr>
+            <w:tcW w:type="dxa" w:w="2880"/>
+          </w:tcPr>
+          <w:p>
+            <w:r>
+              <w:t>Clock in (with photo)</w:t>
             </w:r>
           </w:p>
         </w:tc>
@@ -7368,27 +7361,27 @@
           </w:tcPr>
           <w:p>
             <w:r>
-              <w:t>GET</w:t>
-            </w:r>
-          </w:p>
-        </w:tc>
-        <w:tc>
-          <w:tcPr>
-            <w:tcW w:type="dxa" w:w="2880"/>
-          </w:tcPr>
-          <w:p>
-            <w:r>
-              <w:t>/api/attendance/history[/:name]</w:t>
-            </w:r>
-          </w:p>
-        </w:tc>
-        <w:tc>
-          <w:tcPr>
-            <w:tcW w:type="dxa" w:w="2880"/>
-          </w:tcPr>
-          <w:p>
-            <w:r>
-              <w:t>Attendance history</w:t>
+              <w:t>POST</w:t>
+            </w:r>
+          </w:p>
+        </w:tc>
+        <w:tc>
+          <w:tcPr>
+            <w:tcW w:type="dxa" w:w="2880"/>
+          </w:tcPr>
+          <w:p>
+            <w:r>
+              <w:t>/api/attendance/clock-out</w:t>
+            </w:r>
+          </w:p>
+        </w:tc>
+        <w:tc>
+          <w:tcPr>
+            <w:tcW w:type="dxa" w:w="2880"/>
+          </w:tcPr>
+          <w:p>
+            <w:r>
+              <w:t>Clock out</w:t>
             </w:r>
           </w:p>
         </w:tc>
@@ -7400,6 +7393,38 @@
           </w:tcPr>
           <w:p>
             <w:r>
+              <w:t>GET</w:t>
+            </w:r>
+          </w:p>
+        </w:tc>
+        <w:tc>
+          <w:tcPr>
+            <w:tcW w:type="dxa" w:w="2880"/>
+          </w:tcPr>
+          <w:p>
+            <w:r>
+              <w:t>/api/attendance/history[/:name]</w:t>
+            </w:r>
+          </w:p>
+        </w:tc>
+        <w:tc>
+          <w:tcPr>
+            <w:tcW w:type="dxa" w:w="2880"/>
+          </w:tcPr>
+          <w:p>
+            <w:r>
+              <w:t>Attendance history (admin/manager only)</w:t>
+            </w:r>
+          </w:p>
+        </w:tc>
+      </w:tr>
+      <w:tr>
+        <w:tc>
+          <w:tcPr>
+            <w:tcW w:type="dxa" w:w="2880"/>
+          </w:tcPr>
+          <w:p>
+            <w:r>
               <w:t>POST</w:t>
             </w:r>
           </w:p>
@@ -7420,7 +7445,7 @@
           </w:tcPr>
           <w:p>
             <w:r>
-              <w:t>Save payroll</w:t>
+              <w:t>Save payroll (admin/manager only)</w:t>
             </w:r>
           </w:p>
         </w:tc>
@@ -8838,6 +8863,38 @@
             <w:tcW w:type="dxa" w:w="2880"/>
           </w:tcPr>
           <w:p>
+            <w:r>
+              <w:t>GET</w:t>
+            </w:r>
+          </w:p>
+        </w:tc>
+        <w:tc>
+          <w:tcPr>
+            <w:tcW w:type="dxa" w:w="2880"/>
+          </w:tcPr>
+          <w:p>
+            <w:r>
+              <w:t>/api/pos-products</w:t>
+            </w:r>
+          </w:p>
+        </w:tc>
+        <w:tc>
+          <w:tcPr>
+            <w:tcW w:type="dxa" w:w="2880"/>
+          </w:tcPr>
+          <w:p>
+            <w:r>
+              <w:t>Read-only menu list (id, name, category, price) for the POS register — staff-safe subset of /api/products, omits cost/margin fields</w:t>
+            </w:r>
+          </w:p>
+        </w:tc>
+      </w:tr>
+      <w:tr>
+        <w:tc>
+          <w:tcPr>
+            <w:tcW w:type="dxa" w:w="2880"/>
+          </w:tcPr>
+          <w:p>
             <w:r/>
             <w:r>
               <w:t>GET</w:t>
@@ -9454,6 +9511,38 @@
           <w:p>
             <w:r>
               <w:t>Printing: added a native Android Bluetooth print method — the WebView wrapper app talks to the printer directly through Android’s own Bluetooth stack via a window.AndroidPrinter bridge, avoiding Chrome Web Bluetooth’s reconnect flakiness and needing no separate app. It’s auto-selected as the default when running inside the wrapper app; Printer Setup now offers all three methods (Native / RawBT / Web Bluetooth) and documents the page for the first time. Fixed the Transactions page’s Next/Prev pager buttons rendering white text on a white background (unreadable).</w:t>
+            </w:r>
+          </w:p>
+        </w:tc>
+      </w:tr>
+      <w:tr>
+        <w:tc>
+          <w:tcPr>
+            <w:tcW w:type="dxa" w:w="2880"/>
+          </w:tcPr>
+          <w:p>
+            <w:r>
+              <w:t>0.14.0</w:t>
+            </w:r>
+          </w:p>
+        </w:tc>
+        <w:tc>
+          <w:tcPr>
+            <w:tcW w:type="dxa" w:w="2880"/>
+          </w:tcPr>
+          <w:p>
+            <w:r>
+              <w:t>2026-07-20</w:t>
+            </w:r>
+          </w:p>
+        </w:tc>
+        <w:tc>
+          <w:tcPr>
+            <w:tcW w:type="dxa" w:w="2880"/>
+          </w:tcPr>
+          <w:p>
+            <w:r>
+              <w:t>Fixed staff role: the POS menu, checkout, and clock-in were all silently broken because /api/products, /api/users, /api/attendance, and /api/sales were still admin/manager-gated after staff-role POS support was added — staff got unhandled 403s (empty menu, empty employee picker, and checkout itself would have failed). /api/attendance and /api/sales opened to staff, with payroll/full-history sub-routes individually re-gated to manager; added staff-safe /api/pos-products and /api/attendance/employees (no cost/pay-rate fields) rather than widening the sensitive routes. Also fixed the Android wrapper app: its WebView had no WebChromeClient, so the clock-in photo (getUserMedia) could never succeed there — added the CAMERA permission and a permission-grant bridge in MainActivity.kt.</w:t>
             </w:r>
           </w:p>
         </w:tc>

</xml_diff>

<commit_message>
docs: spec v0.17.0 — reward catalog, void/Orders redesign, printing, QRIS payment
Brings the functional spec up to date with everything since v0.14.0:
soft-cancel voids + verified manager PINs + Orders as the canonical order
log (v0.15.0), the loyalty reward catalog replacing flat redeem-rate plus
the classic-Bluetooth printing correction and hand-drawn-canvas receipt
sharing (v0.16.0), and Menu Credit's bill discount plus the QRIS payment
panel (v0.17.0). Also fixes drift the update surfaced: invoices/
invoice_items were dropped from the schema in migration 030 but still
listed as live tables; migrations 028-033, order_types, pos_sessions,
cash_movements, loyalty_rewards, and loyalty_redemptions were undocumented
entirely.

Co-Authored-By: Claude Sonnet 5 <noreply@anthropic.com>
</commit_message>
<xml_diff>
--- a/docs/8NewLight_Functional_Spec.docx
+++ b/docs/8NewLight_Functional_Spec.docx
@@ -25,13 +25,13 @@
     <w:p>
       <w:r/>
       <w:r>
-        <w:t>Version 0.12.0</w:t>
+        <w:t>Version 0.17.0</w:t>
         <w:br/>
-        <w:t>Date: 2026-07-18</w:t>
+        <w:t>Date: 2026-07-23</w:t>
         <w:br/>
         <w:t>Project: thumbaz_8newlight_codewhale</w:t>
         <w:br/>
-        <w:t>Scope: Complete specification of the deployed back-office system (menu, ingredients, recipes, purchasing, inventory, POS/sales, employees, expenses, budgeting, and analytics, POS register/kitchen/modifiers, customers &amp; loyalty, order types &amp; delivery charges).</w:t>
+        <w:t>Scope: Complete specification of the deployed back-office system (menu, ingredients, recipes, purchasing, inventory, POS/sales, employees, expenses, budgeting, and analytics, POS register/kitchen/modifiers, customers &amp; loyalty rewards, order types &amp; delivery charges, QRIS payment display).</w:t>
       </w:r>
     </w:p>
     <w:p/>
@@ -1495,10 +1495,10 @@
             <w:tcW w:type="dxa" w:w="2160"/>
           </w:tcPr>
           <w:p>
+            <w:r>
+              <w:t>Reward catalog manager: add/edit/retire/delete named rewards, each with a points cost and an optional bill-discount value (e.g. Menu Credit); replaces the old flat redeem-rate model. Also edits earn-rate settings (rupiah per point earned, program on/off).</w:t>
+            </w:r>
             <w:r/>
-            <w:r>
-              <w:t>Editable earn/redeem rules (rupiah per point earned, redeem rate, program on/off), replacing hardcoded constants</w:t>
-            </w:r>
           </w:p>
         </w:tc>
       </w:tr>
@@ -1665,7 +1665,7 @@
           </w:tcPr>
           <w:p>
             <w:r>
-              <w:t>Pair the Bluetooth receipt printer once; three print methods to choose from (Native app printing via the Android wrapper’s own Bluetooth stack — recommended when running inside that app; RawBT bridge app; or direct Web Bluetooth in Chrome). Shows live paired-printer status with Test print + Forget.</w:t>
+              <w:t>Pair the Bluetooth receipt printer once; four print methods to choose from (Native app printing via the Android wrapper’s own Bluetooth stack; RawBT bridge app; direct Web Bluetooth in Chrome — none of which reach a classic-Bluetooth/SPP printer, the shop’s actual hardware; or the regular browser print dialog for a non-Bluetooth printer). Shows live paired-printer status with Test print + Forget.</w:t>
             </w:r>
           </w:p>
         </w:tc>
@@ -2619,6 +2619,198 @@
           </w:p>
         </w:tc>
       </w:tr>
+      <w:tr>
+        <w:tc>
+          <w:tcPr>
+            <w:tcW w:type="dxa" w:w="2880"/>
+          </w:tcPr>
+          <w:p>
+            <w:r>
+              <w:t>028</w:t>
+            </w:r>
+          </w:p>
+        </w:tc>
+        <w:tc>
+          <w:tcPr>
+            <w:tcW w:type="dxa" w:w="2880"/>
+          </w:tcPr>
+          <w:p>
+            <w:r>
+              <w:t>transaction_discount_reason</w:t>
+            </w:r>
+          </w:p>
+        </w:tc>
+        <w:tc>
+          <w:tcPr>
+            <w:tcW w:type="dxa" w:w="2880"/>
+          </w:tcPr>
+          <w:p>
+            <w:r>
+              <w:t>transactions.discount_reason — records why a manager-authorized discount was granted (was collected in the UI but silently discarded)</w:t>
+            </w:r>
+          </w:p>
+        </w:tc>
+      </w:tr>
+      <w:tr>
+        <w:tc>
+          <w:tcPr>
+            <w:tcW w:type="dxa" w:w="2880"/>
+          </w:tcPr>
+          <w:p>
+            <w:r>
+              <w:t>029</w:t>
+            </w:r>
+          </w:p>
+        </w:tc>
+        <w:tc>
+          <w:tcPr>
+            <w:tcW w:type="dxa" w:w="2880"/>
+          </w:tcPr>
+          <w:p>
+            <w:r>
+              <w:t>pos_sessions</w:t>
+            </w:r>
+          </w:p>
+        </w:tc>
+        <w:tc>
+          <w:tcPr>
+            <w:tcW w:type="dxa" w:w="2880"/>
+          </w:tcPr>
+          <w:p>
+            <w:r>
+              <w:t>pos_sessions + cash_movements — shift/session tracking backing Cash In/Out and Close Shift, which previously had no server-side table at all</w:t>
+            </w:r>
+          </w:p>
+        </w:tc>
+      </w:tr>
+      <w:tr>
+        <w:tc>
+          <w:tcPr>
+            <w:tcW w:type="dxa" w:w="2880"/>
+          </w:tcPr>
+          <w:p>
+            <w:r>
+              <w:t>030</w:t>
+            </w:r>
+          </w:p>
+        </w:tc>
+        <w:tc>
+          <w:tcPr>
+            <w:tcW w:type="dxa" w:w="2880"/>
+          </w:tcPr>
+          <w:p>
+            <w:r>
+              <w:t>drop_unused_invoice_receipt_tables</w:t>
+            </w:r>
+          </w:p>
+        </w:tc>
+        <w:tc>
+          <w:tcPr>
+            <w:tcW w:type="dxa" w:w="2880"/>
+          </w:tcPr>
+          <w:p>
+            <w:r>
+              <w:t>Drops invoices/invoice_items (confirmed empty, no working UI) and the never-implemented receipt/receipt_items tables</w:t>
+            </w:r>
+          </w:p>
+        </w:tc>
+      </w:tr>
+      <w:tr>
+        <w:tc>
+          <w:tcPr>
+            <w:tcW w:type="dxa" w:w="2880"/>
+          </w:tcPr>
+          <w:p>
+            <w:r>
+              <w:t>031</w:t>
+            </w:r>
+          </w:p>
+        </w:tc>
+        <w:tc>
+          <w:tcPr>
+            <w:tcW w:type="dxa" w:w="2880"/>
+          </w:tcPr>
+          <w:p>
+            <w:r>
+              <w:t>attendance_location</w:t>
+            </w:r>
+          </w:p>
+        </w:tc>
+        <w:tc>
+          <w:tcPr>
+            <w:tcW w:type="dxa" w:w="2880"/>
+          </w:tcPr>
+          <w:p>
+            <w:r>
+              <w:t>attendances.lat_in/lng_in/lat_out/lng_out — optional GPS captured alongside the clock-in/out photo</w:t>
+            </w:r>
+          </w:p>
+        </w:tc>
+      </w:tr>
+      <w:tr>
+        <w:tc>
+          <w:tcPr>
+            <w:tcW w:type="dxa" w:w="2880"/>
+          </w:tcPr>
+          <w:p>
+            <w:r>
+              <w:t>032</w:t>
+            </w:r>
+          </w:p>
+        </w:tc>
+        <w:tc>
+          <w:tcPr>
+            <w:tcW w:type="dxa" w:w="2880"/>
+          </w:tcPr>
+          <w:p>
+            <w:r>
+              <w:t>loyalty_rewards</w:t>
+            </w:r>
+          </w:p>
+        </w:tc>
+        <w:tc>
+          <w:tcPr>
+            <w:tcW w:type="dxa" w:w="2880"/>
+          </w:tcPr>
+          <w:p>
+            <w:r>
+              <w:t>loyalty_rewards + loyalty_redemptions — named reward catalog (Menu Credit, Merchandise, Alat Kopi tools, Rokpresso) replacing the flat points-to-rupiah redeem_rate, which is zeroed out</w:t>
+            </w:r>
+          </w:p>
+        </w:tc>
+      </w:tr>
+      <w:tr>
+        <w:tc>
+          <w:tcPr>
+            <w:tcW w:type="dxa" w:w="2880"/>
+          </w:tcPr>
+          <w:p>
+            <w:r>
+              <w:t>033</w:t>
+            </w:r>
+          </w:p>
+        </w:tc>
+        <w:tc>
+          <w:tcPr>
+            <w:tcW w:type="dxa" w:w="2880"/>
+          </w:tcPr>
+          <w:p>
+            <w:r>
+              <w:t>loyalty_reward_discount_value</w:t>
+            </w:r>
+          </w:p>
+        </w:tc>
+        <w:tc>
+          <w:tcPr>
+            <w:tcW w:type="dxa" w:w="2880"/>
+          </w:tcPr>
+          <w:p>
+            <w:r>
+              <w:t>loyalty_rewards.discount_value — marks which rewards (e.g. Menu Credit) reduce the CURRENT bill when redeemed mid-Payment, vs. a physical handover</w:t>
+            </w:r>
+          </w:p>
+        </w:tc>
+      </w:tr>
     </w:tbl>
     <w:p/>
     <w:p>
@@ -3285,27 +3477,27 @@
           </w:tcPr>
           <w:p>
             <w:r>
-              <w:t>Invoice</w:t>
-            </w:r>
-          </w:p>
-        </w:tc>
-        <w:tc>
-          <w:tcPr>
-            <w:tcW w:type="dxa" w:w="2880"/>
-          </w:tcPr>
-          <w:p>
-            <w:r>
-              <w:t>invoices + invoice_items</w:t>
-            </w:r>
-          </w:p>
-        </w:tc>
-        <w:tc>
-          <w:tcPr>
-            <w:tcW w:type="dxa" w:w="2880"/>
-          </w:tcPr>
-          <w:p>
-            <w:r>
-              <w:t>Alternative sales/billing records</w:t>
+              <w:t>Expense</w:t>
+            </w:r>
+          </w:p>
+        </w:tc>
+        <w:tc>
+          <w:tcPr>
+            <w:tcW w:type="dxa" w:w="2880"/>
+          </w:tcPr>
+          <w:p>
+            <w:r>
+              <w:t>expenses</w:t>
+            </w:r>
+          </w:p>
+        </w:tc>
+        <w:tc>
+          <w:tcPr>
+            <w:tcW w:type="dxa" w:w="2880"/>
+          </w:tcPr>
+          <w:p>
+            <w:r>
+              <w:t>Non-ingredient operating costs by category</w:t>
             </w:r>
           </w:p>
         </w:tc>
@@ -3317,27 +3509,27 @@
           </w:tcPr>
           <w:p>
             <w:r>
-              <w:t>Expense</w:t>
-            </w:r>
-          </w:p>
-        </w:tc>
-        <w:tc>
-          <w:tcPr>
-            <w:tcW w:type="dxa" w:w="2880"/>
-          </w:tcPr>
-          <w:p>
-            <w:r>
-              <w:t>expenses</w:t>
-            </w:r>
-          </w:p>
-        </w:tc>
-        <w:tc>
-          <w:tcPr>
-            <w:tcW w:type="dxa" w:w="2880"/>
-          </w:tcPr>
-          <w:p>
-            <w:r>
-              <w:t>Non-ingredient operating costs by category</w:t>
+              <w:t>Employee</w:t>
+            </w:r>
+          </w:p>
+        </w:tc>
+        <w:tc>
+          <w:tcPr>
+            <w:tcW w:type="dxa" w:w="2880"/>
+          </w:tcPr>
+          <w:p>
+            <w:r>
+              <w:t>users</w:t>
+            </w:r>
+          </w:p>
+        </w:tc>
+        <w:tc>
+          <w:tcPr>
+            <w:tcW w:type="dxa" w:w="2880"/>
+          </w:tcPr>
+          <w:p>
+            <w:r>
+              <w:t>Role-based; rate for payroll</w:t>
             </w:r>
           </w:p>
         </w:tc>
@@ -3349,27 +3541,27 @@
           </w:tcPr>
           <w:p>
             <w:r>
-              <w:t>Employee</w:t>
-            </w:r>
-          </w:p>
-        </w:tc>
-        <w:tc>
-          <w:tcPr>
-            <w:tcW w:type="dxa" w:w="2880"/>
-          </w:tcPr>
-          <w:p>
-            <w:r>
-              <w:t>users</w:t>
-            </w:r>
-          </w:p>
-        </w:tc>
-        <w:tc>
-          <w:tcPr>
-            <w:tcW w:type="dxa" w:w="2880"/>
-          </w:tcPr>
-          <w:p>
-            <w:r>
-              <w:t>Role-based; rate for payroll</w:t>
+              <w:t>Attendance</w:t>
+            </w:r>
+          </w:p>
+        </w:tc>
+        <w:tc>
+          <w:tcPr>
+            <w:tcW w:type="dxa" w:w="2880"/>
+          </w:tcPr>
+          <w:p>
+            <w:r>
+              <w:t>attendances</w:t>
+            </w:r>
+          </w:p>
+        </w:tc>
+        <w:tc>
+          <w:tcPr>
+            <w:tcW w:type="dxa" w:w="2880"/>
+          </w:tcPr>
+          <w:p>
+            <w:r>
+              <w:t>Clock in/out with photos</w:t>
             </w:r>
           </w:p>
         </w:tc>
@@ -3381,27 +3573,27 @@
           </w:tcPr>
           <w:p>
             <w:r>
-              <w:t>Attendance</w:t>
-            </w:r>
-          </w:p>
-        </w:tc>
-        <w:tc>
-          <w:tcPr>
-            <w:tcW w:type="dxa" w:w="2880"/>
-          </w:tcPr>
-          <w:p>
-            <w:r>
-              <w:t>attendances</w:t>
-            </w:r>
-          </w:p>
-        </w:tc>
-        <w:tc>
-          <w:tcPr>
-            <w:tcW w:type="dxa" w:w="2880"/>
-          </w:tcPr>
-          <w:p>
-            <w:r>
-              <w:t>Clock in/out with photos</w:t>
+              <w:t>Payroll</w:t>
+            </w:r>
+          </w:p>
+        </w:tc>
+        <w:tc>
+          <w:tcPr>
+            <w:tcW w:type="dxa" w:w="2880"/>
+          </w:tcPr>
+          <w:p>
+            <w:r>
+              <w:t>payroll</w:t>
+            </w:r>
+          </w:p>
+        </w:tc>
+        <w:tc>
+          <w:tcPr>
+            <w:tcW w:type="dxa" w:w="2880"/>
+          </w:tcPr>
+          <w:p>
+            <w:r>
+              <w:t>Monthly overtime/bonus/deduction per user</w:t>
             </w:r>
           </w:p>
         </w:tc>
@@ -3413,27 +3605,27 @@
           </w:tcPr>
           <w:p>
             <w:r>
-              <w:t>Payroll</w:t>
-            </w:r>
-          </w:p>
-        </w:tc>
-        <w:tc>
-          <w:tcPr>
-            <w:tcW w:type="dxa" w:w="2880"/>
-          </w:tcPr>
-          <w:p>
-            <w:r>
-              <w:t>payroll</w:t>
-            </w:r>
-          </w:p>
-        </w:tc>
-        <w:tc>
-          <w:tcPr>
-            <w:tcW w:type="dxa" w:w="2880"/>
-          </w:tcPr>
-          <w:p>
-            <w:r>
-              <w:t>Monthly overtime/bonus/deduction per user</w:t>
+              <w:t>Budget</w:t>
+            </w:r>
+          </w:p>
+        </w:tc>
+        <w:tc>
+          <w:tcPr>
+            <w:tcW w:type="dxa" w:w="2880"/>
+          </w:tcPr>
+          <w:p>
+            <w:r>
+              <w:t>budgets</w:t>
+            </w:r>
+          </w:p>
+        </w:tc>
+        <w:tc>
+          <w:tcPr>
+            <w:tcW w:type="dxa" w:w="2880"/>
+          </w:tcPr>
+          <w:p>
+            <w:r>
+              <w:t>Monthly target amounts by kind + category</w:t>
             </w:r>
           </w:p>
         </w:tc>
@@ -3445,27 +3637,27 @@
           </w:tcPr>
           <w:p>
             <w:r>
-              <w:t>Budget</w:t>
-            </w:r>
-          </w:p>
-        </w:tc>
-        <w:tc>
-          <w:tcPr>
-            <w:tcW w:type="dxa" w:w="2880"/>
-          </w:tcPr>
-          <w:p>
-            <w:r>
-              <w:t>budgets</w:t>
-            </w:r>
-          </w:p>
-        </w:tc>
-        <w:tc>
-          <w:tcPr>
-            <w:tcW w:type="dxa" w:w="2880"/>
-          </w:tcPr>
-          <w:p>
-            <w:r>
-              <w:t>Monthly target amounts by kind + category</w:t>
+              <w:t>KPI target</w:t>
+            </w:r>
+          </w:p>
+        </w:tc>
+        <w:tc>
+          <w:tcPr>
+            <w:tcW w:type="dxa" w:w="2880"/>
+          </w:tcPr>
+          <w:p>
+            <w:r>
+              <w:t>kpi_targets</w:t>
+            </w:r>
+          </w:p>
+        </w:tc>
+        <w:tc>
+          <w:tcPr>
+            <w:tcW w:type="dxa" w:w="2880"/>
+          </w:tcPr>
+          <w:p>
+            <w:r>
+              <w:t>Thresholds for the scorecard</w:t>
             </w:r>
           </w:p>
         </w:tc>
@@ -3476,28 +3668,31 @@
             <w:tcW w:type="dxa" w:w="2880"/>
           </w:tcPr>
           <w:p>
-            <w:r>
-              <w:t>KPI target</w:t>
-            </w:r>
-          </w:p>
-        </w:tc>
-        <w:tc>
-          <w:tcPr>
-            <w:tcW w:type="dxa" w:w="2880"/>
-          </w:tcPr>
-          <w:p>
-            <w:r>
-              <w:t>kpi_targets</w:t>
-            </w:r>
-          </w:p>
-        </w:tc>
-        <w:tc>
-          <w:tcPr>
-            <w:tcW w:type="dxa" w:w="2880"/>
-          </w:tcPr>
-          <w:p>
-            <w:r>
-              <w:t>Thresholds for the scorecard</w:t>
+            <w:r/>
+            <w:r>
+              <w:t>Customer</w:t>
+            </w:r>
+          </w:p>
+        </w:tc>
+        <w:tc>
+          <w:tcPr>
+            <w:tcW w:type="dxa" w:w="2880"/>
+          </w:tcPr>
+          <w:p>
+            <w:r/>
+            <w:r>
+              <w:t>customers</w:t>
+            </w:r>
+          </w:p>
+        </w:tc>
+        <w:tc>
+          <w:tcPr>
+            <w:tcW w:type="dxa" w:w="2880"/>
+          </w:tcPr>
+          <w:p>
+            <w:r/>
+            <w:r>
+              <w:t>Loyalty member; referenced by transactions.customer_id</w:t>
             </w:r>
           </w:p>
         </w:tc>
@@ -3510,7 +3705,7 @@
           <w:p>
             <w:r/>
             <w:r>
-              <w:t>Customer</w:t>
+              <w:t>Loyalty config</w:t>
             </w:r>
           </w:p>
         </w:tc>
@@ -3521,7 +3716,7 @@
           <w:p>
             <w:r/>
             <w:r>
-              <w:t>customers</w:t>
+              <w:t>loyalty_config</w:t>
             </w:r>
           </w:p>
         </w:tc>
@@ -3532,7 +3727,7 @@
           <w:p>
             <w:r/>
             <w:r>
-              <w:t>Loyalty member; referenced by transactions.customer_id</w:t>
+              <w:t>Single row (id=1): earn/redeem rules read by sales.js at checkout</w:t>
             </w:r>
           </w:p>
         </w:tc>
@@ -3545,7 +3740,7 @@
           <w:p>
             <w:r/>
             <w:r>
-              <w:t>Loyalty config</w:t>
+              <w:t>Modifier</w:t>
             </w:r>
           </w:p>
         </w:tc>
@@ -3556,7 +3751,7 @@
           <w:p>
             <w:r/>
             <w:r>
-              <w:t>loyalty_config</w:t>
+              <w:t>modifiers</w:t>
             </w:r>
           </w:p>
         </w:tc>
@@ -3567,7 +3762,7 @@
           <w:p>
             <w:r/>
             <w:r>
-              <w:t>Single row (id=1): earn/redeem rules read by sales.js at checkout</w:t>
+              <w:t>POS add-on; optional product_id links it to a recipe for stock deduction</w:t>
             </w:r>
           </w:p>
         </w:tc>
@@ -3580,7 +3775,7 @@
           <w:p>
             <w:r/>
             <w:r>
-              <w:t>Modifier</w:t>
+              <w:t>Kitchen ticket</w:t>
             </w:r>
           </w:p>
         </w:tc>
@@ -3591,7 +3786,7 @@
           <w:p>
             <w:r/>
             <w:r>
-              <w:t>modifiers</w:t>
+              <w:t>kitchen_tickets + kitchen_items</w:t>
             </w:r>
           </w:p>
         </w:tc>
@@ -3602,7 +3797,7 @@
           <w:p>
             <w:r/>
             <w:r>
-              <w:t>POS add-on; optional product_id links it to a recipe for stock deduction</w:t>
+              <w:t>"Send to Bar" order fed to the barista queue (KDS)</w:t>
             </w:r>
           </w:p>
         </w:tc>
@@ -3615,7 +3810,7 @@
           <w:p>
             <w:r/>
             <w:r>
-              <w:t>Kitchen ticket</w:t>
+              <w:t>Void log</w:t>
             </w:r>
           </w:p>
         </w:tc>
@@ -3626,7 +3821,7 @@
           <w:p>
             <w:r/>
             <w:r>
-              <w:t>kitchen_tickets + kitchen_items</w:t>
+              <w:t>void_log</w:t>
             </w:r>
           </w:p>
         </w:tc>
@@ -3637,7 +3832,7 @@
           <w:p>
             <w:r/>
             <w:r>
-              <w:t>"Send to Bar" order fed to the barista queue (KDS)</w:t>
+              <w:t>Audit record of reversed sales (kept after the transaction itself is deleted)</w:t>
             </w:r>
           </w:p>
         </w:tc>
@@ -3648,31 +3843,28 @@
             <w:tcW w:type="dxa" w:w="2880"/>
           </w:tcPr>
           <w:p>
-            <w:r/>
-            <w:r>
-              <w:t>Void log</w:t>
-            </w:r>
-          </w:p>
-        </w:tc>
-        <w:tc>
-          <w:tcPr>
-            <w:tcW w:type="dxa" w:w="2880"/>
-          </w:tcPr>
-          <w:p>
-            <w:r/>
-            <w:r>
-              <w:t>void_log</w:t>
-            </w:r>
-          </w:p>
-        </w:tc>
-        <w:tc>
-          <w:tcPr>
-            <w:tcW w:type="dxa" w:w="2880"/>
-          </w:tcPr>
-          <w:p>
-            <w:r/>
-            <w:r>
-              <w:t>Audit record of reversed sales (kept after the transaction itself is deleted)</w:t>
+            <w:r>
+              <w:t>Reward</w:t>
+            </w:r>
+          </w:p>
+        </w:tc>
+        <w:tc>
+          <w:tcPr>
+            <w:tcW w:type="dxa" w:w="2880"/>
+          </w:tcPr>
+          <w:p>
+            <w:r>
+              <w:t>loyalty_rewards + loyalty_redemptions</w:t>
+            </w:r>
+          </w:p>
+        </w:tc>
+        <w:tc>
+          <w:tcPr>
+            <w:tcW w:type="dxa" w:w="2880"/>
+          </w:tcPr>
+          <w:p>
+            <w:r>
+              <w:t>Named catalog a customer spends points on; optional discount_value ties a reward to a rupiah bill discount</w:t>
             </w:r>
           </w:p>
         </w:tc>
@@ -3994,6 +4186,9 @@
             <w:r>
               <w:t>, customer_id, points_earned, redeem_points, redeem_value, discount_pct, discount_amount, customer_note</w:t>
             </w:r>
+            <w:r>
+              <w:t>, discount_reason</w:t>
+            </w:r>
           </w:p>
         </w:tc>
       </w:tr>
@@ -4026,7 +4221,7 @@
           </w:tcPr>
           <w:p>
             <w:r>
-              <w:t>invoices</w:t>
+              <w:t>expenses</w:t>
             </w:r>
           </w:p>
         </w:tc>
@@ -4036,7 +4231,7 @@
           </w:tcPr>
           <w:p>
             <w:r>
-              <w:t>id, date, payment_type, total_amount, notes, created_by, created_at, updated_at</w:t>
+              <w:t>id, date, category, description, amount, notes, created_at</w:t>
             </w:r>
           </w:p>
         </w:tc>
@@ -4048,7 +4243,7 @@
           </w:tcPr>
           <w:p>
             <w:r>
-              <w:t>invoice_items</w:t>
+              <w:t>users</w:t>
             </w:r>
           </w:p>
         </w:tc>
@@ -4058,7 +4253,7 @@
           </w:tcPr>
           <w:p>
             <w:r>
-              <w:t>id, invoice_id, product_id, quantity, unit_price, line_total</w:t>
+              <w:t>id, name, role, pin_hash, rate, phone, notes, active, created_at</w:t>
             </w:r>
           </w:p>
         </w:tc>
@@ -4070,7 +4265,7 @@
           </w:tcPr>
           <w:p>
             <w:r>
-              <w:t>expenses</w:t>
+              <w:t>attendances</w:t>
             </w:r>
           </w:p>
         </w:tc>
@@ -4080,7 +4275,10 @@
           </w:tcPr>
           <w:p>
             <w:r>
-              <w:t>id, date, category, description, amount, notes, created_at</w:t>
+              <w:t>id, user_id, employee_name, clock_in, clock_out, photo_in, photo_out, notes, created_at</w:t>
+            </w:r>
+            <w:r>
+              <w:t>, lat_in, lng_in, lat_out, lng_out</w:t>
             </w:r>
           </w:p>
         </w:tc>
@@ -4092,7 +4290,7 @@
           </w:tcPr>
           <w:p>
             <w:r>
-              <w:t>users</w:t>
+              <w:t>payroll</w:t>
             </w:r>
           </w:p>
         </w:tc>
@@ -4102,7 +4300,7 @@
           </w:tcPr>
           <w:p>
             <w:r>
-              <w:t>id, name, role, pin_hash, rate, phone, notes, active, created_at</w:t>
+              <w:t>user_id, month, overtime, bonus, deduction</w:t>
             </w:r>
           </w:p>
         </w:tc>
@@ -4114,7 +4312,7 @@
           </w:tcPr>
           <w:p>
             <w:r>
-              <w:t>attendances</w:t>
+              <w:t>budgets</w:t>
             </w:r>
           </w:p>
         </w:tc>
@@ -4124,7 +4322,7 @@
           </w:tcPr>
           <w:p>
             <w:r>
-              <w:t>id, user_id, employee_name, clock_in, clock_out, photo_in, photo_out, notes, created_at</w:t>
+              <w:t>id, month, kind, category, amount, sort_order, created_at, updated_at</w:t>
             </w:r>
           </w:p>
         </w:tc>
@@ -4136,7 +4334,7 @@
           </w:tcPr>
           <w:p>
             <w:r>
-              <w:t>payroll</w:t>
+              <w:t>kpi_targets</w:t>
             </w:r>
           </w:p>
         </w:tc>
@@ -4146,7 +4344,7 @@
           </w:tcPr>
           <w:p>
             <w:r>
-              <w:t>user_id, month, overtime, bonus, deduction</w:t>
+              <w:t>metric, label, direction, target_low, target_high, unit, sort_order</w:t>
             </w:r>
           </w:p>
         </w:tc>
@@ -4158,7 +4356,7 @@
           </w:tcPr>
           <w:p>
             <w:r>
-              <w:t>budgets</w:t>
+              <w:t>units</w:t>
             </w:r>
           </w:p>
         </w:tc>
@@ -4168,7 +4366,7 @@
           </w:tcPr>
           <w:p>
             <w:r>
-              <w:t>id, month, kind, category, amount, sort_order, created_at, updated_at</w:t>
+              <w:t>code, name</w:t>
             </w:r>
           </w:p>
         </w:tc>
@@ -4179,8 +4377,9 @@
             <w:tcW w:type="dxa" w:w="4320"/>
           </w:tcPr>
           <w:p>
-            <w:r>
-              <w:t>kpi_targets</w:t>
+            <w:r/>
+            <w:r>
+              <w:t>customers</w:t>
             </w:r>
           </w:p>
         </w:tc>
@@ -4189,8 +4388,9 @@
             <w:tcW w:type="dxa" w:w="4320"/>
           </w:tcPr>
           <w:p>
-            <w:r>
-              <w:t>metric, label, direction, target_low, target_high, unit, sort_order</w:t>
+            <w:r/>
+            <w:r>
+              <w:t>id, name, member_id, phone, email, points_balance, created_at, updated_at</w:t>
             </w:r>
           </w:p>
         </w:tc>
@@ -4201,8 +4401,9 @@
             <w:tcW w:type="dxa" w:w="4320"/>
           </w:tcPr>
           <w:p>
-            <w:r>
-              <w:t>units</w:t>
+            <w:r/>
+            <w:r>
+              <w:t>loyalty_config</w:t>
             </w:r>
           </w:p>
         </w:tc>
@@ -4211,8 +4412,9 @@
             <w:tcW w:type="dxa" w:w="4320"/>
           </w:tcPr>
           <w:p>
-            <w:r>
-              <w:t>code, name</w:t>
+            <w:r/>
+            <w:r>
+              <w:t>id (=1), earn_base, earn_points, redeem_rate, enabled, updated_at</w:t>
             </w:r>
           </w:p>
         </w:tc>
@@ -4225,7 +4427,7 @@
           <w:p>
             <w:r/>
             <w:r>
-              <w:t>customers</w:t>
+              <w:t>modifiers</w:t>
             </w:r>
           </w:p>
         </w:tc>
@@ -4236,7 +4438,7 @@
           <w:p>
             <w:r/>
             <w:r>
-              <w:t>id, name, member_id, phone, email, points_balance, created_at, updated_at</w:t>
+              <w:t>id, name, price_delta, active, product_id, created_at</w:t>
             </w:r>
           </w:p>
         </w:tc>
@@ -4249,7 +4451,7 @@
           <w:p>
             <w:r/>
             <w:r>
-              <w:t>loyalty_config</w:t>
+              <w:t>kitchen_tickets</w:t>
             </w:r>
           </w:p>
         </w:tc>
@@ -4260,7 +4462,7 @@
           <w:p>
             <w:r/>
             <w:r>
-              <w:t>id (=1), earn_base, earn_points, redeem_rate, enabled, updated_at</w:t>
+              <w:t>id, order_ref, table_label, order_type, status, created_at, updated_at</w:t>
             </w:r>
           </w:p>
         </w:tc>
@@ -4273,7 +4475,7 @@
           <w:p>
             <w:r/>
             <w:r>
-              <w:t>modifiers</w:t>
+              <w:t>kitchen_items</w:t>
             </w:r>
           </w:p>
         </w:tc>
@@ -4284,7 +4486,7 @@
           <w:p>
             <w:r/>
             <w:r>
-              <w:t>id, name, price_delta, active, product_id, created_at</w:t>
+              <w:t>id, ticket_id, product_id, name, qty, note</w:t>
             </w:r>
           </w:p>
         </w:tc>
@@ -4297,7 +4499,7 @@
           <w:p>
             <w:r/>
             <w:r>
-              <w:t>kitchen_tickets</w:t>
+              <w:t>void_log</w:t>
             </w:r>
           </w:p>
         </w:tc>
@@ -4308,7 +4510,7 @@
           <w:p>
             <w:r/>
             <w:r>
-              <w:t>id, order_ref, table_label, order_type, status, created_at, updated_at</w:t>
+              <w:t>id, transaction_id, total, items, reason, restocked, voided_at</w:t>
             </w:r>
           </w:p>
         </w:tc>
@@ -4319,9 +4521,8 @@
             <w:tcW w:type="dxa" w:w="4320"/>
           </w:tcPr>
           <w:p>
-            <w:r/>
-            <w:r>
-              <w:t>kitchen_items</w:t>
+            <w:r>
+              <w:t>order_types</w:t>
             </w:r>
           </w:p>
         </w:tc>
@@ -4330,9 +4531,8 @@
             <w:tcW w:type="dxa" w:w="4320"/>
           </w:tcPr>
           <w:p>
-            <w:r/>
-            <w:r>
-              <w:t>id, ticket_id, product_id, name, qty, note</w:t>
+            <w:r>
+              <w:t>id, name, per_item_discount, active, sort_order, updated_at</w:t>
             </w:r>
           </w:p>
         </w:tc>
@@ -4343,9 +4543,8 @@
             <w:tcW w:type="dxa" w:w="4320"/>
           </w:tcPr>
           <w:p>
-            <w:r/>
-            <w:r>
-              <w:t>void_log</w:t>
+            <w:r>
+              <w:t>pos_sessions</w:t>
             </w:r>
           </w:p>
         </w:tc>
@@ -4354,9 +4553,74 @@
             <w:tcW w:type="dxa" w:w="4320"/>
           </w:tcPr>
           <w:p>
-            <w:r/>
-            <w:r>
-              <w:t>id, transaction_id, total, items, reason, restocked, voided_at</w:t>
+            <w:r>
+              <w:t>id, opened_at, opened_by, opening_cash, status, closed_at, closed_by, counted_cash, counted_card, counted_qris, expected_cash, expected_card, expected_qris, variance_cash, variance_card, variance_qris, notes</w:t>
+            </w:r>
+          </w:p>
+        </w:tc>
+      </w:tr>
+      <w:tr>
+        <w:tc>
+          <w:tcPr>
+            <w:tcW w:type="dxa" w:w="4320"/>
+          </w:tcPr>
+          <w:p>
+            <w:r>
+              <w:t>cash_movements</w:t>
+            </w:r>
+          </w:p>
+        </w:tc>
+        <w:tc>
+          <w:tcPr>
+            <w:tcW w:type="dxa" w:w="4320"/>
+          </w:tcPr>
+          <w:p>
+            <w:r>
+              <w:t>id, session_id, type, amount, reason, created_at, created_by</w:t>
+            </w:r>
+          </w:p>
+        </w:tc>
+      </w:tr>
+      <w:tr>
+        <w:tc>
+          <w:tcPr>
+            <w:tcW w:type="dxa" w:w="4320"/>
+          </w:tcPr>
+          <w:p>
+            <w:r>
+              <w:t>loyalty_rewards</w:t>
+            </w:r>
+          </w:p>
+        </w:tc>
+        <w:tc>
+          <w:tcPr>
+            <w:tcW w:type="dxa" w:w="4320"/>
+          </w:tcPr>
+          <w:p>
+            <w:r>
+              <w:t>id, name, description, points_cost, discount_value, active, sort_order, created_at, updated_at</w:t>
+            </w:r>
+          </w:p>
+        </w:tc>
+      </w:tr>
+      <w:tr>
+        <w:tc>
+          <w:tcPr>
+            <w:tcW w:type="dxa" w:w="4320"/>
+          </w:tcPr>
+          <w:p>
+            <w:r>
+              <w:t>loyalty_redemptions</w:t>
+            </w:r>
+          </w:p>
+        </w:tc>
+        <w:tc>
+          <w:tcPr>
+            <w:tcW w:type="dxa" w:w="4320"/>
+          </w:tcPr>
+          <w:p>
+            <w:r>
+              <w:t>id, customer_id, reward_id, reward_name, points_cost, redeemed_by, notes, redeemed_at</w:t>
             </w:r>
           </w:p>
         </w:tc>
@@ -4535,6 +4799,46 @@
     </w:p>
     <w:p>
       <w:pPr>
+        <w:pStyle w:val="ListBullet"/>
+      </w:pPr>
+      <w:r>
+        <w:t>Loyalty redemption runs through a named reward catalog (loyalty_rewards / loyalty_redemptions, migration 032) instead of a flat points-to-rupiah rate — customers redeem specific rewards (Menu Credit, Merchandise, Alat Kopi tools, Rokpresso). A reward’s optional discount_value (migration 033) lets it reduce the CURRENT bill when redeemed mid-Payment (used by Menu Credit, Rp 15.000) instead of just being a logged handover; the Loyalty modal closes automatically once a bill discount is applied.</w:t>
+      </w:r>
+    </w:p>
+    <w:p>
+      <w:pPr>
+        <w:pStyle w:val="ListBullet"/>
+      </w:pPr>
+      <w:r>
+        <w:t>Voids are soft-cancel, not delete: a voided sale/item is tagged status = ‘Dibatalkan’ / ‘Batal Sebagian’ with quantity/line_total zeroed and original/cancelled quantities preserved, so it stays visible in Transaction History and Orders instead of disappearing. Manager PIN entry (discount, void) is verified server-side against a real admin/manager account (verifyManagerPin), not merely collected.</w:t>
+      </w:r>
+    </w:p>
+    <w:p>
+      <w:pPr>
+        <w:pStyle w:val="ListBullet"/>
+      </w:pPr>
+      <w:r>
+        <w:t>Orders (ordersView in the New POS) is the canonical order log and reprint picker: every completed sale is logged there (not just Held ones), filterable All/Active/Paid/Invoice, with Cancel Order (blocked once the kitchen marks an order Served) and Void Sale available directly from the order detail panel.</w:t>
+      </w:r>
+    </w:p>
+    <w:p>
+      <w:pPr>
+        <w:pStyle w:val="ListBullet"/>
+      </w:pPr>
+      <w:r>
+        <w:t>Payment supports Cash, Card, and QRIS. Selecting QRIS shows the merchant name/NMID, a QR code generated from the shop’s bank-verified static QRIS payload (decoded and CRC-checked from the printed poster, not fabricated), and the exact live total to transfer — letting the customer pay from their seat instead of walking to the counter; the cashier still confirms once the transfer lands.</w:t>
+      </w:r>
+    </w:p>
+    <w:p>
+      <w:pPr>
+        <w:pStyle w:val="ListBullet"/>
+      </w:pPr>
+      <w:r>
+        <w:t>Receipts print via one of four methods chosen once in Printer Setup (native Android Bluetooth, RawBT bridge, direct Web Bluetooth, or the regular browser print dialog), since the shop’s actual printer is classic Bluetooth (SPP), not BLE — only the non-Web-Bluetooth paths can reach it. “Send via WhatsApp” shares an actual receipt image (hand-drawn to a canvas from the on-screen receipt, not a DOM screenshot — SVG foreignObject unconditionally taints canvas export in Chrome) via the Web Share API.</w:t>
+      </w:r>
+    </w:p>
+    <w:p>
+      <w:pPr>
         <w:pStyle w:val="Heading2"/>
       </w:pPr>
       <w:r>
@@ -9023,6 +9327,166 @@
           </w:p>
         </w:tc>
       </w:tr>
+      <w:tr>
+        <w:tc>
+          <w:tcPr>
+            <w:tcW w:type="dxa" w:w="2880"/>
+          </w:tcPr>
+          <w:p>
+            <w:r>
+              <w:t>GET</w:t>
+            </w:r>
+          </w:p>
+        </w:tc>
+        <w:tc>
+          <w:tcPr>
+            <w:tcW w:type="dxa" w:w="2880"/>
+          </w:tcPr>
+          <w:p>
+            <w:r>
+              <w:t>/api/loyalty-rewards</w:t>
+            </w:r>
+          </w:p>
+        </w:tc>
+        <w:tc>
+          <w:tcPr>
+            <w:tcW w:type="dxa" w:w="2880"/>
+          </w:tcPr>
+          <w:p>
+            <w:r>
+              <w:t>List the reward catalog (active only by default; ?all=1 for Loyalty Setup, includes retired rewards)</w:t>
+            </w:r>
+          </w:p>
+        </w:tc>
+      </w:tr>
+      <w:tr>
+        <w:tc>
+          <w:tcPr>
+            <w:tcW w:type="dxa" w:w="2880"/>
+          </w:tcPr>
+          <w:p>
+            <w:r>
+              <w:t>POST/PUT</w:t>
+            </w:r>
+          </w:p>
+        </w:tc>
+        <w:tc>
+          <w:tcPr>
+            <w:tcW w:type="dxa" w:w="2880"/>
+          </w:tcPr>
+          <w:p>
+            <w:r>
+              <w:t>/api/loyalty-rewards[/:id]</w:t>
+            </w:r>
+          </w:p>
+        </w:tc>
+        <w:tc>
+          <w:tcPr>
+            <w:tcW w:type="dxa" w:w="2880"/>
+          </w:tcPr>
+          <w:p>
+            <w:r>
+              <w:t>Admin/manager: add or edit a reward’s name, description, points_cost, active flag, and optional discount_value</w:t>
+            </w:r>
+          </w:p>
+        </w:tc>
+      </w:tr>
+      <w:tr>
+        <w:tc>
+          <w:tcPr>
+            <w:tcW w:type="dxa" w:w="2880"/>
+          </w:tcPr>
+          <w:p>
+            <w:r>
+              <w:t>DELETE</w:t>
+            </w:r>
+          </w:p>
+        </w:tc>
+        <w:tc>
+          <w:tcPr>
+            <w:tcW w:type="dxa" w:w="2880"/>
+          </w:tcPr>
+          <w:p>
+            <w:r>
+              <w:t>/api/loyalty-rewards/:id</w:t>
+            </w:r>
+          </w:p>
+        </w:tc>
+        <w:tc>
+          <w:tcPr>
+            <w:tcW w:type="dxa" w:w="2880"/>
+          </w:tcPr>
+          <w:p>
+            <w:r>
+              <w:t>Admin/manager: remove a reward from the catalog (past redemptions keep their own name/points snapshot)</w:t>
+            </w:r>
+          </w:p>
+        </w:tc>
+      </w:tr>
+      <w:tr>
+        <w:tc>
+          <w:tcPr>
+            <w:tcW w:type="dxa" w:w="2880"/>
+          </w:tcPr>
+          <w:p>
+            <w:r>
+              <w:t>POST</w:t>
+            </w:r>
+          </w:p>
+        </w:tc>
+        <w:tc>
+          <w:tcPr>
+            <w:tcW w:type="dxa" w:w="2880"/>
+          </w:tcPr>
+          <w:p>
+            <w:r>
+              <w:t>/api/loyalty-rewards/:id/redeem</w:t>
+            </w:r>
+          </w:p>
+        </w:tc>
+        <w:tc>
+          <w:tcPr>
+            <w:tcW w:type="dxa" w:w="2880"/>
+          </w:tcPr>
+          <w:p>
+            <w:r>
+              <w:t>Spend a customer’s points on a reward; deducts points_balance and logs a loyalty_redemptions row. Returns discount_value so the POS can apply a bill discount if redeemed mid-Payment</w:t>
+            </w:r>
+          </w:p>
+        </w:tc>
+      </w:tr>
+      <w:tr>
+        <w:tc>
+          <w:tcPr>
+            <w:tcW w:type="dxa" w:w="2880"/>
+          </w:tcPr>
+          <w:p>
+            <w:r>
+              <w:t>GET</w:t>
+            </w:r>
+          </w:p>
+        </w:tc>
+        <w:tc>
+          <w:tcPr>
+            <w:tcW w:type="dxa" w:w="2880"/>
+          </w:tcPr>
+          <w:p>
+            <w:r>
+              <w:t>/api/loyalty-rewards/redemptions/:customerId</w:t>
+            </w:r>
+          </w:p>
+        </w:tc>
+        <w:tc>
+          <w:tcPr>
+            <w:tcW w:type="dxa" w:w="2880"/>
+          </w:tcPr>
+          <w:p>
+            <w:r>
+              <w:t>A customer’s redemption history (most recent 50)</w:t>
+            </w:r>
+          </w:p>
+        </w:tc>
+      </w:tr>
     </w:tbl>
     <w:p>
       <w:pPr>
@@ -9543,6 +10007,102 @@
           <w:p>
             <w:r>
               <w:t>Fixed staff role: the POS menu, checkout, and clock-in were all silently broken because /api/products, /api/users, /api/attendance, and /api/sales were still admin/manager-gated after staff-role POS support was added — staff got unhandled 403s (empty menu, empty employee picker, and checkout itself would have failed). /api/attendance and /api/sales opened to staff, with payroll/full-history sub-routes individually re-gated to manager; added staff-safe /api/pos-products and /api/attendance/employees (no cost/pay-rate fields) rather than widening the sensitive routes. Also fixed the Android wrapper app: its WebView had no WebChromeClient, so the clock-in photo (getUserMedia) could never succeed there — added the CAMERA permission and a permission-grant bridge in MainActivity.kt.</w:t>
+            </w:r>
+          </w:p>
+        </w:tc>
+      </w:tr>
+      <w:tr>
+        <w:tc>
+          <w:tcPr>
+            <w:tcW w:type="dxa" w:w="2880"/>
+          </w:tcPr>
+          <w:p>
+            <w:r>
+              <w:t>0.15.0</w:t>
+            </w:r>
+          </w:p>
+        </w:tc>
+        <w:tc>
+          <w:tcPr>
+            <w:tcW w:type="dxa" w:w="2880"/>
+          </w:tcPr>
+          <w:p>
+            <w:r>
+              <w:t>2026-07-21</w:t>
+            </w:r>
+          </w:p>
+        </w:tc>
+        <w:tc>
+          <w:tcPr>
+            <w:tcW w:type="dxa" w:w="2880"/>
+          </w:tcPr>
+          <w:p>
+            <w:r>
+              <w:t>Void is now soft-cancel (status = Dibatalkan/Batal Sebagian, quantity/line_total zeroed, original/cancelled quantities preserved) instead of deleting rows, matching how the Riwayat import already tags a cancelled receipt. Manager PIN is now actually verified server-side (verifyManagerPin) for discounts and voids, not merely collected; discount_reason is now recorded (migration 028). Orders view un-hidden and made the canonical order log/reprint picker — every completed sale is logged there, filterable All/Active/Paid/Invoice, with Cancel Order and Void Sale in the detail panel; the standalone Reprint Receipt picker built earlier was removed as redundant. Fixed a real bug where kitchen ticket status was matched on a nonexistent field (ticket.order_id instead of order_ref), silently falling back to a colliding table_label match and showing orders a random other order’s kitchen status. Checkout footer redesigned to Pay / Clear Cart / Void / Hold / ⋯, with the kitchen only notified once a sale is actually paid.</w:t>
+            </w:r>
+          </w:p>
+        </w:tc>
+      </w:tr>
+      <w:tr>
+        <w:tc>
+          <w:tcPr>
+            <w:tcW w:type="dxa" w:w="2880"/>
+          </w:tcPr>
+          <w:p>
+            <w:r>
+              <w:t>0.16.0</w:t>
+            </w:r>
+          </w:p>
+        </w:tc>
+        <w:tc>
+          <w:tcPr>
+            <w:tcW w:type="dxa" w:w="2880"/>
+          </w:tcPr>
+          <w:p>
+            <w:r>
+              <w:t>2026-07-22</w:t>
+            </w:r>
+          </w:p>
+        </w:tc>
+        <w:tc>
+          <w:tcPr>
+            <w:tcW w:type="dxa" w:w="2880"/>
+          </w:tcPr>
+          <w:p>
+            <w:r>
+              <w:t>Loyalty reward catalog (loyalty_rewards + loyalty_redemptions, migration 032) replaces the flat points-to-rupiah redeem_rate: named rewards (Menu Credit, Merchandise, Alat Kopi tools, Rokpresso) with an inline-editable catalog manager in Loyalty Setup. Receipt printing corrected after learning the shop’s printer is classic Bluetooth (SPP), not BLE — direct Web Bluetooth can’t reach it, so the receipt modal collapsed to one “Print Receipt” button that defers to whichever of four methods (native/RawBT/Web Bluetooth/regular browser print) was chosen once in Printer Setup. “Send via WhatsApp” rebuilt to share an actual receipt image via the Web Share API after discovering SVG foreignObject unconditionally taints canvas export in Chrome — both it and the public receipt page’s own share button now hand-draw the receipt to a canvas instead of capturing the rendered DOM.</w:t>
+            </w:r>
+          </w:p>
+        </w:tc>
+      </w:tr>
+      <w:tr>
+        <w:tc>
+          <w:tcPr>
+            <w:tcW w:type="dxa" w:w="2880"/>
+          </w:tcPr>
+          <w:p>
+            <w:r>
+              <w:t>0.17.0</w:t>
+            </w:r>
+          </w:p>
+        </w:tc>
+        <w:tc>
+          <w:tcPr>
+            <w:tcW w:type="dxa" w:w="2880"/>
+          </w:tcPr>
+          <w:p>
+            <w:r>
+              <w:t>2026-07-23</w:t>
+            </w:r>
+          </w:p>
+        </w:tc>
+        <w:tc>
+          <w:tcPr>
+            <w:tcW w:type="dxa" w:w="2880"/>
+          </w:tcPr>
+          <w:p>
+            <w:r>
+              <w:t>Menu Credit’s reward gained a discount_value (migration 033) so redeeming it mid-Payment actually reduces the current bill (clamped, recorded on the sale, reflected on every receipt surface — modal, thermal/browser print, WhatsApp image, and the public receipt page, which was also found and fixed silently ignoring discounts in its total). Payment modal gained a QRIS panel: merchant name/NMID, a QR code generated from the shop’s bank-issued static QRIS payload (decoded and CRC-verified from the printed poster, not fabricated), and the exact live total, so a customer can pay from their seat. Fixed a CSS specificity bug where several .modal-row elements (#tenderRow, .pay-quickcash, .pay-discount-auth, and the new QRIS panel) had their own later `display` rule silently beating the shared `.hidden` class, so they never actually hid when they should have.</w:t>
             </w:r>
           </w:p>
         </w:tc>

</xml_diff>